<commit_message>
commit before sorting problem with bib
</commit_message>
<xml_diff>
--- a/CONTROLO 2026/final_Development of Control Strategies for Earthquake Reproduction.docx
+++ b/CONTROLO 2026/final_Development of Control Strategies for Earthquake Reproduction.docx
@@ -403,7 +403,6 @@
         </w:rPr>
         <w:br/>
       </w:r>
-      <w:proofErr w:type="spellStart"/>
       <w:r>
         <w:rPr>
           <w:noProof w:val="0"/>
@@ -420,9 +419,8 @@
           <w:szCs w:val="18"/>
           <w:lang w:val="pt-PT"/>
         </w:rPr>
-        <w:t>lling</w:t>
-      </w:r>
-      <w:proofErr w:type="spellEnd"/>
+        <w:t>lling and Rock Mechanics</w:t>
+      </w:r>
       <w:r>
         <w:rPr>
           <w:noProof w:val="0"/>
@@ -430,9 +428,8 @@
           <w:szCs w:val="18"/>
           <w:lang w:val="pt-PT"/>
         </w:rPr>
-        <w:t xml:space="preserve"> </w:t>
-      </w:r>
-      <w:proofErr w:type="spellStart"/>
+        <w:t xml:space="preserve"> Unit (</w:t>
+      </w:r>
       <w:r>
         <w:rPr>
           <w:noProof w:val="0"/>
@@ -440,9 +437,8 @@
           <w:szCs w:val="18"/>
           <w:lang w:val="pt-PT"/>
         </w:rPr>
-        <w:t>and</w:t>
-      </w:r>
-      <w:proofErr w:type="spellEnd"/>
+        <w:t>NMMR/DBB</w:t>
+      </w:r>
       <w:r>
         <w:rPr>
           <w:noProof w:val="0"/>
@@ -450,19 +446,30 @@
           <w:szCs w:val="18"/>
           <w:lang w:val="pt-PT"/>
         </w:rPr>
-        <w:t xml:space="preserve"> Rock </w:t>
-      </w:r>
-      <w:proofErr w:type="spellStart"/>
-      <w:r>
-        <w:rPr>
+        <w:t>)</w:t>
+      </w:r>
+      <w:r>
+        <w:rPr>
+          <w:lang w:val="pt-PT"/>
+        </w:rPr>
+        <w:br/>
+      </w:r>
+      <w:r>
+        <w:rPr>
+          <w:i/>
           <w:noProof w:val="0"/>
           <w:sz w:val="18"/>
           <w:szCs w:val="18"/>
           <w:lang w:val="pt-PT"/>
         </w:rPr>
-        <w:t>Mechanics</w:t>
-      </w:r>
-      <w:proofErr w:type="spellEnd"/>
+        <w:t xml:space="preserve">Laboratório Nacional de Engenharia Civil (LNEC)          </w:t>
+      </w:r>
+      <w:r>
+        <w:rPr>
+          <w:lang w:val="pt-PT"/>
+        </w:rPr>
+        <w:br/>
+      </w:r>
       <w:r>
         <w:rPr>
           <w:noProof w:val="0"/>
@@ -470,109 +477,7 @@
           <w:szCs w:val="18"/>
           <w:lang w:val="pt-PT"/>
         </w:rPr>
-        <w:t xml:space="preserve"> </w:t>
-      </w:r>
-      <w:proofErr w:type="spellStart"/>
-      <w:r>
-        <w:rPr>
-          <w:noProof w:val="0"/>
-          <w:sz w:val="18"/>
-          <w:szCs w:val="18"/>
-          <w:lang w:val="pt-PT"/>
-        </w:rPr>
-        <w:t>Unit</w:t>
-      </w:r>
-      <w:proofErr w:type="spellEnd"/>
-      <w:r>
-        <w:rPr>
-          <w:noProof w:val="0"/>
-          <w:sz w:val="18"/>
-          <w:szCs w:val="18"/>
-          <w:lang w:val="pt-PT"/>
-        </w:rPr>
-        <w:t xml:space="preserve"> (</w:t>
-      </w:r>
-      <w:r>
-        <w:rPr>
-          <w:noProof w:val="0"/>
-          <w:sz w:val="18"/>
-          <w:szCs w:val="18"/>
-          <w:lang w:val="pt-PT"/>
-        </w:rPr>
-        <w:t>NMMR/DBB</w:t>
-      </w:r>
-      <w:r>
-        <w:rPr>
-          <w:noProof w:val="0"/>
-          <w:sz w:val="18"/>
-          <w:szCs w:val="18"/>
-          <w:lang w:val="pt-PT"/>
-        </w:rPr>
-        <w:t>)</w:t>
-      </w:r>
-      <w:r>
-        <w:rPr>
-          <w:lang w:val="pt-PT"/>
-        </w:rPr>
-        <w:br/>
-      </w:r>
-      <w:r>
-        <w:rPr>
-          <w:i/>
-          <w:noProof w:val="0"/>
-          <w:sz w:val="18"/>
-          <w:szCs w:val="18"/>
-          <w:lang w:val="pt-PT"/>
-        </w:rPr>
-        <w:t>Laboratório Nacional de Engenharia Civil (</w:t>
-      </w:r>
-      <w:proofErr w:type="gramStart"/>
-      <w:r>
-        <w:rPr>
-          <w:i/>
-          <w:noProof w:val="0"/>
-          <w:sz w:val="18"/>
-          <w:szCs w:val="18"/>
-          <w:lang w:val="pt-PT"/>
-        </w:rPr>
-        <w:t xml:space="preserve">LNEC)   </w:t>
-      </w:r>
-      <w:proofErr w:type="gramEnd"/>
-      <w:r>
-        <w:rPr>
-          <w:i/>
-          <w:noProof w:val="0"/>
-          <w:sz w:val="18"/>
-          <w:szCs w:val="18"/>
-          <w:lang w:val="pt-PT"/>
-        </w:rPr>
-        <w:t xml:space="preserve">       </w:t>
-      </w:r>
-      <w:r>
-        <w:rPr>
-          <w:lang w:val="pt-PT"/>
-        </w:rPr>
-        <w:br/>
-      </w:r>
-      <w:proofErr w:type="spellStart"/>
-      <w:r>
-        <w:rPr>
-          <w:noProof w:val="0"/>
-          <w:sz w:val="18"/>
-          <w:szCs w:val="18"/>
-          <w:lang w:val="pt-PT"/>
-        </w:rPr>
-        <w:t>Lisbon</w:t>
-      </w:r>
-      <w:proofErr w:type="spellEnd"/>
-      <w:r>
-        <w:rPr>
-          <w:noProof w:val="0"/>
-          <w:sz w:val="18"/>
-          <w:szCs w:val="18"/>
-          <w:lang w:val="pt-PT"/>
-        </w:rPr>
-        <w:t xml:space="preserve">, </w:t>
+        <w:t xml:space="preserve">Lisbon, </w:t>
       </w:r>
       <w:r>
         <w:rPr>
@@ -1165,21 +1070,8 @@
         </w:rPr>
         <w:t xml:space="preserve"> </w:t>
       </w:r>
-      <w:proofErr w:type="spellStart"/>
-      <w:r>
-        <w:t>Laboratório</w:t>
-      </w:r>
-      <w:proofErr w:type="spellEnd"/>
-      <w:r>
-        <w:t xml:space="preserve"> Nacional de </w:t>
-      </w:r>
-      <w:proofErr w:type="spellStart"/>
-      <w:r>
-        <w:t>Engenharia</w:t>
-      </w:r>
-      <w:proofErr w:type="spellEnd"/>
-      <w:r>
-        <w:t xml:space="preserve"> Civil </w:t>
+      <w:r>
+        <w:t xml:space="preserve">Laboratório Nacional de Engenharia Civil </w:t>
       </w:r>
       <w:r>
         <w:t>(</w:t>
@@ -1405,7 +1297,7 @@
     </w:p>
     <w:p>
       <w:pPr>
-        <w:pStyle w:val="Heading1"/>
+        <w:pStyle w:val="Ttulo1"/>
         <w:rPr>
           <w:noProof w:val="0"/>
         </w:rPr>
@@ -1419,7 +1311,7 @@
     </w:p>
     <w:p>
       <w:pPr>
-        <w:pStyle w:val="BodyText"/>
+        <w:pStyle w:val="Corpodetexto"/>
       </w:pPr>
       <w:r>
         <w:t>Earthquakes are among the most catastrophic natural events, frequently causing severe loss of life, extensive property damage, and significant socio‑economic disruption. One of the most effective ways to reduce seismic risk is by decreasing the structural vulnerability of the built environment, which can be assessed through experimental techniques such as shaking‑table testing.</w:t>
@@ -1430,18 +1322,10 @@
     </w:p>
     <w:p>
       <w:pPr>
-        <w:pStyle w:val="BodyText"/>
-      </w:pPr>
-      <w:r>
-        <w:t xml:space="preserve">Shaking‑table tests consist of mounting a physical model on a stiff platform that is driven </w:t>
-      </w:r>
-      <w:proofErr w:type="gramStart"/>
-      <w:r>
-        <w:t>so as to</w:t>
-      </w:r>
-      <w:proofErr w:type="gramEnd"/>
-      <w:r>
-        <w:t xml:space="preserve"> reproduce the desired ground‑motion time history (reference signal). This experimental technique was introduced in the 1940s and became widespread during the 1960s. Early systems relied on mechanical profiled cams to generate the excitation, but servo‑hydraulic systems soon became the standard solution</w:t>
+        <w:pStyle w:val="Corpodetexto"/>
+      </w:pPr>
+      <w:r>
+        <w:t>Shaking‑table tests consist of mounting a physical model on a stiff platform that is driven so as to reproduce the desired ground‑motion time history (reference signal). This experimental technique was introduced in the 1940s and became widespread during the 1960s. Early systems relied on mechanical profiled cams to generate the excitation, but servo‑hydraulic systems soon became the standard solution</w:t>
       </w:r>
       <w:r>
         <w:t xml:space="preserve"> </w:t>
@@ -1513,331 +1397,291 @@
         <w:t xml:space="preserve">At </w:t>
       </w:r>
       <w:r>
+        <w:t>the Laboratório Nacional de Engenharia Civil (</w:t>
+      </w:r>
+      <w:r>
+        <w:t>LNEC</w:t>
+      </w:r>
+      <w:r>
+        <w:t>)</w:t>
+      </w:r>
+      <w:r>
+        <w:t xml:space="preserve"> a Goodmans model VG-108 electrodynamic shaker attached to a movable table</w:t>
+      </w:r>
+      <w:r>
+        <w:t xml:space="preserve"> was installed in the 60s</w:t>
+      </w:r>
+      <w:r>
+        <w:t xml:space="preserve"> </w:t>
+      </w:r>
+      <w:r>
+        <w:t xml:space="preserve">to perform </w:t>
+      </w:r>
+      <w:r>
+        <w:t>seismic tests</w:t>
+      </w:r>
+      <w:r>
+        <w:t xml:space="preserve"> </w:t>
+      </w:r>
+      <w:r>
+        <w:fldChar w:fldCharType="begin"/>
+      </w:r>
+      <w:r>
+        <w:instrText xml:space="preserve"> REF _Ref228380040 \n \h </w:instrText>
+      </w:r>
+      <w:r>
+        <w:fldChar w:fldCharType="separate"/>
+      </w:r>
+      <w:r>
+        <w:t>[4]</w:t>
+      </w:r>
+      <w:r>
+        <w:fldChar w:fldCharType="end"/>
+      </w:r>
+      <w:r>
+        <w:t xml:space="preserve">. </w:t>
+      </w:r>
+      <w:r>
+        <w:t>A</w:t>
+      </w:r>
+      <w:r>
+        <w:t xml:space="preserve"> uniaxial shaking table (ST1D) was </w:t>
+      </w:r>
+      <w:r>
+        <w:t>developed and installed, consisting of a 3 m × 2 m horizontal steel platform and a vertical platform body driven by a hydraulic actuator supplied by a dedicated oil‑hydraulic circuit</w:t>
+      </w:r>
+      <w:r>
+        <w:t xml:space="preserve"> (</w:t>
+      </w:r>
+      <w:r>
+        <w:fldChar w:fldCharType="begin"/>
+      </w:r>
+      <w:r>
+        <w:instrText xml:space="preserve"> REF _Ref228380530 \n \h </w:instrText>
+      </w:r>
+      <w:r>
+        <w:fldChar w:fldCharType="separate"/>
+      </w:r>
+      <w:r>
+        <w:t>[5]</w:t>
+      </w:r>
+      <w:r>
+        <w:fldChar w:fldCharType="end"/>
+      </w:r>
+      <w:r>
+        <w:t xml:space="preserve">, </w:t>
+      </w:r>
+      <w:r>
+        <w:fldChar w:fldCharType="begin"/>
+      </w:r>
+      <w:r>
+        <w:instrText xml:space="preserve"> REF _Ref228380531 \n \h </w:instrText>
+      </w:r>
+      <w:r>
+        <w:fldChar w:fldCharType="separate"/>
+      </w:r>
+      <w:r>
+        <w:t>[6]</w:t>
+      </w:r>
+      <w:r>
+        <w:fldChar w:fldCharType="end"/>
+      </w:r>
+      <w:r>
+        <w:t>)</w:t>
+      </w:r>
+      <w:r>
+        <w:t xml:space="preserve">. </w:t>
+      </w:r>
+      <w:r>
+        <w:t xml:space="preserve">During this period, adaptive control strategies were developed, implemented, and validated both on </w:t>
+      </w:r>
+      <w:r>
+        <w:t>a small</w:t>
+      </w:r>
+      <w:r>
+        <w:t xml:space="preserve"> </w:t>
+      </w:r>
+      <w:r>
+        <w:t>scale shaking table and on the ST1D,</w:t>
+      </w:r>
+      <w:r>
+        <w:t xml:space="preserve"> </w:t>
+      </w:r>
+      <w:r>
+        <w:t>for tracking</w:t>
+      </w:r>
+      <w:r>
+        <w:t xml:space="preserve"> </w:t>
+      </w:r>
+      <w:r>
+        <w:t>reference earthquake</w:t>
+      </w:r>
+      <w:r>
+        <w:t xml:space="preserve"> </w:t>
+      </w:r>
+      <w:r>
+        <w:t>spectrum (frequency domain)</w:t>
+      </w:r>
+      <w:r>
+        <w:t>,</w:t>
+      </w:r>
+      <w:r>
+        <w:t xml:space="preserve"> iteratively (</w:t>
+      </w:r>
+      <w:r>
+        <w:fldChar w:fldCharType="begin"/>
+      </w:r>
+      <w:r>
+        <w:instrText xml:space="preserve"> REF _Ref228403345 \r \h </w:instrText>
+      </w:r>
+      <w:r>
+        <w:fldChar w:fldCharType="separate"/>
+      </w:r>
+      <w:r>
+        <w:t>[7]</w:t>
+      </w:r>
+      <w:r>
+        <w:fldChar w:fldCharType="end"/>
+      </w:r>
+      <w:r>
+        <w:t>,</w:t>
+      </w:r>
+      <w:r>
+        <w:fldChar w:fldCharType="begin"/>
+      </w:r>
+      <w:r>
+        <w:instrText xml:space="preserve"> REF _Ref228403347 \r \h </w:instrText>
+      </w:r>
+      <w:r>
+        <w:fldChar w:fldCharType="separate"/>
+      </w:r>
+      <w:r>
+        <w:t>[8]</w:t>
+      </w:r>
+      <w:r>
+        <w:fldChar w:fldCharType="end"/>
+      </w:r>
+      <w:r>
+        <w:t>).</w:t>
+      </w:r>
+      <w:r>
+        <w:t xml:space="preserve"> </w:t>
+      </w:r>
+      <w:r>
+        <w:t xml:space="preserve">Increasingly demanding requirements for reproducing seismic excitation along all three directions motivated the development of the triaxial shaking table </w:t>
+      </w:r>
+      <w:r>
+        <w:t>(</w:t>
+      </w:r>
+      <w:r>
+        <w:t>ST3D</w:t>
+      </w:r>
+      <w:r>
+        <w:t>)</w:t>
+      </w:r>
+      <w:r>
+        <w:t xml:space="preserve">, which has been installed and operational at LNEC since the mid‑1990s </w:t>
+      </w:r>
+      <w:r>
+        <w:fldChar w:fldCharType="begin"/>
+      </w:r>
+      <w:r>
+        <w:instrText xml:space="preserve"> REF _Ref228380040 \n \h </w:instrText>
+      </w:r>
+      <w:r>
+        <w:fldChar w:fldCharType="separate"/>
+      </w:r>
+      <w:r>
+        <w:t>[4]</w:t>
+      </w:r>
+      <w:r>
+        <w:fldChar w:fldCharType="end"/>
+      </w:r>
+      <w:r>
+        <w:t>.</w:t>
+      </w:r>
+      <w:r>
+        <w:t xml:space="preserve"> </w:t>
+      </w:r>
+      <w:r>
+        <w:t>The reproduction of earthquake</w:t>
+      </w:r>
+      <w:r>
+        <w:t>s</w:t>
+      </w:r>
+      <w:r>
+        <w:t xml:space="preserve"> on a shaking table </w:t>
+      </w:r>
+      <w:r>
+        <w:t>depend</w:t>
+      </w:r>
+      <w:r>
+        <w:t>s strongly on</w:t>
+      </w:r>
+      <w:r>
+        <w:t>: i)</w:t>
+      </w:r>
+      <w:r>
+        <w:t xml:space="preserve"> </w:t>
+      </w:r>
+      <w:r>
         <w:t xml:space="preserve">the </w:t>
       </w:r>
-      <w:proofErr w:type="spellStart"/>
-      <w:r>
-        <w:t>Laboratório</w:t>
-      </w:r>
-      <w:proofErr w:type="spellEnd"/>
-      <w:r>
-        <w:t xml:space="preserve"> Nacional de </w:t>
-      </w:r>
-      <w:proofErr w:type="spellStart"/>
-      <w:r>
-        <w:t>Engenharia</w:t>
-      </w:r>
-      <w:proofErr w:type="spellEnd"/>
-      <w:r>
-        <w:t xml:space="preserve"> Civil (</w:t>
-      </w:r>
-      <w:r>
-        <w:t>LNEC</w:t>
-      </w:r>
-      <w:r>
-        <w:t>)</w:t>
-      </w:r>
-      <w:r>
-        <w:t xml:space="preserve"> a Goodmans model VG-108 electrodynamic shaker attached to a movable table</w:t>
-      </w:r>
-      <w:r>
-        <w:t xml:space="preserve"> was installed in the 60s</w:t>
-      </w:r>
-      <w:r>
-        <w:t xml:space="preserve"> </w:t>
-      </w:r>
-      <w:r>
-        <w:t xml:space="preserve">to perform </w:t>
-      </w:r>
-      <w:r>
-        <w:t>seismic tests</w:t>
-      </w:r>
-      <w:r>
-        <w:t xml:space="preserve"> </w:t>
-      </w:r>
-      <w:r>
-        <w:fldChar w:fldCharType="begin"/>
-      </w:r>
-      <w:r>
-        <w:instrText xml:space="preserve"> REF _Ref228380040 \n \h </w:instrText>
-      </w:r>
-      <w:r>
-        <w:fldChar w:fldCharType="separate"/>
-      </w:r>
-      <w:r>
-        <w:t>[4]</w:t>
-      </w:r>
-      <w:r>
-        <w:fldChar w:fldCharType="end"/>
-      </w:r>
-      <w:r>
-        <w:t xml:space="preserve">. </w:t>
-      </w:r>
-      <w:r>
-        <w:t>A</w:t>
-      </w:r>
-      <w:r>
-        <w:t xml:space="preserve"> uniaxial shaking table (ST1D) was </w:t>
-      </w:r>
-      <w:r>
-        <w:t>developed and installed, consisting of a 3 m × 2 m horizontal steel platform and a vertical platform body driven by a hydraulic actuator supplied by a dedicated oil‑hydraulic circuit</w:t>
-      </w:r>
-      <w:r>
-        <w:t xml:space="preserve"> (</w:t>
-      </w:r>
-      <w:r>
-        <w:fldChar w:fldCharType="begin"/>
-      </w:r>
-      <w:r>
-        <w:instrText xml:space="preserve"> REF _Ref228380530 \n \h </w:instrText>
-      </w:r>
-      <w:r>
-        <w:fldChar w:fldCharType="separate"/>
-      </w:r>
-      <w:r>
-        <w:t>[5]</w:t>
-      </w:r>
-      <w:r>
-        <w:fldChar w:fldCharType="end"/>
-      </w:r>
-      <w:r>
-        <w:t xml:space="preserve">, </w:t>
-      </w:r>
-      <w:r>
-        <w:fldChar w:fldCharType="begin"/>
-      </w:r>
-      <w:r>
-        <w:instrText xml:space="preserve"> REF _Ref228380531 \n \h </w:instrText>
-      </w:r>
-      <w:r>
-        <w:fldChar w:fldCharType="separate"/>
-      </w:r>
-      <w:r>
-        <w:t>[6]</w:t>
-      </w:r>
-      <w:r>
-        <w:fldChar w:fldCharType="end"/>
-      </w:r>
-      <w:r>
-        <w:t>)</w:t>
-      </w:r>
-      <w:r>
-        <w:t xml:space="preserve">. </w:t>
-      </w:r>
-      <w:r>
-        <w:t xml:space="preserve">During this period, adaptive control strategies were developed, implemented, and validated both on </w:t>
-      </w:r>
-      <w:r>
-        <w:t xml:space="preserve">a </w:t>
-      </w:r>
-      <w:proofErr w:type="gramStart"/>
-      <w:r>
-        <w:t>small</w:t>
-      </w:r>
-      <w:r>
-        <w:t xml:space="preserve"> </w:t>
-      </w:r>
-      <w:r>
-        <w:t>scale</w:t>
-      </w:r>
-      <w:proofErr w:type="gramEnd"/>
-      <w:r>
-        <w:t xml:space="preserve"> shaking table and on the ST1D,</w:t>
-      </w:r>
-      <w:r>
-        <w:t xml:space="preserve"> </w:t>
-      </w:r>
-      <w:r>
-        <w:t>for tracking</w:t>
-      </w:r>
-      <w:r>
-        <w:t xml:space="preserve"> </w:t>
-      </w:r>
-      <w:r>
-        <w:t>reference earthquake</w:t>
-      </w:r>
-      <w:r>
-        <w:t xml:space="preserve"> </w:t>
-      </w:r>
-      <w:r>
-        <w:t>spectrum (frequency domain)</w:t>
+      <w:r>
+        <w:t>hardware (mechanical</w:t>
+      </w:r>
+      <w:r>
+        <w:t xml:space="preserve"> and electrical</w:t>
+      </w:r>
+      <w:r>
+        <w:t xml:space="preserve"> </w:t>
+      </w:r>
+      <w:r>
+        <w:t>system)</w:t>
+      </w:r>
+      <w:r>
+        <w:t xml:space="preserve">, which usually </w:t>
+      </w:r>
+      <w:r>
+        <w:t xml:space="preserve">has limitations and therefore </w:t>
+      </w:r>
+      <w:r>
+        <w:t xml:space="preserve">can </w:t>
+      </w:r>
+      <w:r>
+        <w:t>distort</w:t>
+      </w:r>
+      <w:r>
+        <w:t xml:space="preserve"> the reference signal</w:t>
+      </w:r>
+      <w:r>
+        <w:t xml:space="preserve"> </w:t>
+      </w:r>
+      <w:r>
+        <w:t>and</w:t>
+      </w:r>
+      <w:r>
+        <w:t>; ii)</w:t>
+      </w:r>
+      <w:r>
+        <w:t xml:space="preserve"> </w:t>
+      </w:r>
+      <w:r>
+        <w:t>the control system, whose performance is highly sensitive to the adopted control strategy and tuning</w:t>
+      </w:r>
+      <w:r>
+        <w:t>.</w:t>
+      </w:r>
+      <w:r>
+        <w:t xml:space="preserve"> The </w:t>
+      </w:r>
+      <w:r>
+        <w:t>hydraulic and control system supplier, MTS Systems Corporation (MTS)</w:t>
       </w:r>
       <w:r>
         <w:t>,</w:t>
       </w:r>
       <w:r>
-        <w:t xml:space="preserve"> iteratively (</w:t>
-      </w:r>
-      <w:r>
-        <w:fldChar w:fldCharType="begin"/>
-      </w:r>
-      <w:r>
-        <w:instrText xml:space="preserve"> REF _Ref228403345 \r \h </w:instrText>
-      </w:r>
-      <w:r>
-        <w:fldChar w:fldCharType="separate"/>
-      </w:r>
-      <w:r>
-        <w:t>[7]</w:t>
-      </w:r>
-      <w:r>
-        <w:fldChar w:fldCharType="end"/>
-      </w:r>
-      <w:r>
-        <w:t>,</w:t>
-      </w:r>
-      <w:r>
-        <w:fldChar w:fldCharType="begin"/>
-      </w:r>
-      <w:r>
-        <w:instrText xml:space="preserve"> REF _Ref228403347 \r \h </w:instrText>
-      </w:r>
-      <w:r>
-        <w:fldChar w:fldCharType="separate"/>
-      </w:r>
-      <w:r>
-        <w:t>[8]</w:t>
-      </w:r>
-      <w:r>
-        <w:fldChar w:fldCharType="end"/>
-      </w:r>
-      <w:r>
-        <w:t>).</w:t>
-      </w:r>
-      <w:r>
-        <w:t xml:space="preserve"> </w:t>
-      </w:r>
-      <w:r>
-        <w:t xml:space="preserve">Increasingly demanding requirements for reproducing seismic excitation along all three directions motivated the development of the triaxial shaking table </w:t>
-      </w:r>
-      <w:r>
-        <w:t>(</w:t>
-      </w:r>
-      <w:r>
-        <w:t>ST3D</w:t>
-      </w:r>
-      <w:r>
-        <w:t>)</w:t>
-      </w:r>
-      <w:r>
-        <w:t xml:space="preserve">, which has been installed and operational at LNEC since the mid‑1990s </w:t>
-      </w:r>
-      <w:r>
-        <w:fldChar w:fldCharType="begin"/>
-      </w:r>
-      <w:r>
-        <w:instrText xml:space="preserve"> REF _Ref228380040 \n \h </w:instrText>
-      </w:r>
-      <w:r>
-        <w:fldChar w:fldCharType="separate"/>
-      </w:r>
-      <w:r>
-        <w:t>[4]</w:t>
-      </w:r>
-      <w:r>
-        <w:fldChar w:fldCharType="end"/>
-      </w:r>
-      <w:r>
-        <w:t>.</w:t>
-      </w:r>
-      <w:r>
-        <w:t xml:space="preserve"> </w:t>
-      </w:r>
-      <w:r>
-        <w:t>The reproduction of earthquake</w:t>
-      </w:r>
-      <w:r>
-        <w:t>s</w:t>
-      </w:r>
-      <w:r>
-        <w:t xml:space="preserve"> on a shaking table </w:t>
-      </w:r>
-      <w:r>
-        <w:t>depend</w:t>
-      </w:r>
-      <w:r>
-        <w:t xml:space="preserve">s strongly </w:t>
-      </w:r>
-      <w:proofErr w:type="gramStart"/>
-      <w:r>
-        <w:t>on</w:t>
-      </w:r>
-      <w:r>
-        <w:t>:</w:t>
-      </w:r>
-      <w:proofErr w:type="gramEnd"/>
-      <w:r>
-        <w:t xml:space="preserve"> </w:t>
-      </w:r>
-      <w:proofErr w:type="spellStart"/>
-      <w:r>
-        <w:t>i</w:t>
-      </w:r>
-      <w:proofErr w:type="spellEnd"/>
-      <w:r>
-        <w:t>)</w:t>
-      </w:r>
-      <w:r>
-        <w:t xml:space="preserve"> </w:t>
-      </w:r>
-      <w:r>
-        <w:t xml:space="preserve">the </w:t>
-      </w:r>
-      <w:r>
-        <w:t>hardware (mechanical</w:t>
-      </w:r>
-      <w:r>
-        <w:t xml:space="preserve"> and electrical</w:t>
-      </w:r>
-      <w:r>
-        <w:t xml:space="preserve"> </w:t>
-      </w:r>
-      <w:r>
-        <w:t>system)</w:t>
-      </w:r>
-      <w:r>
-        <w:t xml:space="preserve">, which usually </w:t>
-      </w:r>
-      <w:r>
-        <w:t xml:space="preserve">has limitations and therefore </w:t>
-      </w:r>
-      <w:r>
-        <w:t xml:space="preserve">can </w:t>
-      </w:r>
-      <w:r>
-        <w:t>distort</w:t>
-      </w:r>
-      <w:r>
-        <w:t xml:space="preserve"> the reference signal</w:t>
-      </w:r>
-      <w:r>
-        <w:t xml:space="preserve"> </w:t>
-      </w:r>
-      <w:r>
-        <w:t>and</w:t>
-      </w:r>
-      <w:r>
-        <w:t>; ii)</w:t>
-      </w:r>
-      <w:r>
-        <w:t xml:space="preserve"> </w:t>
-      </w:r>
-      <w:r>
-        <w:t>the control system, whose performance is highly sensitive to the adopted control strategy and tuning</w:t>
-      </w:r>
-      <w:r>
-        <w:t>.</w:t>
-      </w:r>
-      <w:r>
-        <w:t xml:space="preserve"> The </w:t>
-      </w:r>
-      <w:r>
-        <w:t>hydraulic and control system supplier, MTS Systems Corporation (MTS)</w:t>
-      </w:r>
-      <w:r>
-        <w:t>,</w:t>
-      </w:r>
-      <w:r>
         <w:t xml:space="preserve"> </w:t>
       </w:r>
       <w:r>
@@ -1850,15 +1694,7 @@
         <w:t>control strategies</w:t>
       </w:r>
       <w:r>
-        <w:t xml:space="preserve">: </w:t>
-      </w:r>
-      <w:proofErr w:type="spellStart"/>
-      <w:r>
-        <w:t>i</w:t>
-      </w:r>
-      <w:proofErr w:type="spellEnd"/>
-      <w:r>
-        <w:t>) Three-Variable Control (TVC), also known in control theory literature as state variable control</w:t>
+        <w:t>: i) Three-Variable Control (TVC), also known in control theory literature as state variable control</w:t>
       </w:r>
       <w:r>
         <w:t xml:space="preserve"> </w:t>
@@ -2019,7 +1855,7 @@
     </w:p>
     <w:p>
       <w:pPr>
-        <w:pStyle w:val="BodyText"/>
+        <w:pStyle w:val="Corpodetexto"/>
       </w:pPr>
       <w:r>
         <w:t>S</w:t>
@@ -2144,13 +1980,8 @@
       <w:r>
         <w:t xml:space="preserve">Alternative control approaches have been proposed in the literature, including: </w:t>
       </w:r>
-      <w:proofErr w:type="spellStart"/>
-      <w:r>
-        <w:t>i</w:t>
-      </w:r>
-      <w:proofErr w:type="spellEnd"/>
-      <w:r>
-        <w:t>) Acceleration Trajectory Tracking Control (ATTC)</w:t>
+      <w:r>
+        <w:t>i) Acceleration Trajectory Tracking Control (ATTC)</w:t>
       </w:r>
       <w:r>
         <w:t xml:space="preserve"> [13]</w:t>
@@ -2246,21 +2077,13 @@
     </w:p>
     <w:p>
       <w:pPr>
-        <w:pStyle w:val="BodyText"/>
+        <w:pStyle w:val="Corpodetexto"/>
       </w:pPr>
       <w:r>
         <w:t>For the</w:t>
       </w:r>
       <w:r>
-        <w:t xml:space="preserve"> OLI strategy currently implemented at LNEC’s shaking table, several limitations can be identified: </w:t>
-      </w:r>
-      <w:proofErr w:type="spellStart"/>
-      <w:r>
-        <w:t>i</w:t>
-      </w:r>
-      <w:proofErr w:type="spellEnd"/>
-      <w:r>
-        <w:t>) the PI</w:t>
+        <w:t xml:space="preserve"> OLI strategy currently implemented at LNEC’s shaking table, several limitations can be identified: i) the PI</w:t>
       </w:r>
       <w:r>
         <w:t>D</w:t>
@@ -2337,13 +2160,8 @@
       <w:r>
         <w:t xml:space="preserve"> </w:t>
       </w:r>
-      <w:proofErr w:type="spellStart"/>
-      <w:r>
-        <w:t>i</w:t>
-      </w:r>
-      <w:proofErr w:type="spellEnd"/>
-      <w:r>
-        <w:t xml:space="preserve">) </w:t>
+      <w:r>
+        <w:t xml:space="preserve">i) </w:t>
       </w:r>
       <w:r>
         <w:t xml:space="preserve">a </w:t>
@@ -2574,20 +2392,12 @@
         <w:fldChar w:fldCharType="end"/>
       </w:r>
       <w:r>
-        <w:t xml:space="preserve">. The physical implementation of the controller will be carried out </w:t>
-      </w:r>
-      <w:proofErr w:type="gramStart"/>
-      <w:r>
-        <w:t>in the near future</w:t>
-      </w:r>
-      <w:proofErr w:type="gramEnd"/>
-      <w:r>
-        <w:t xml:space="preserve"> to fully confirm and validate the approach on the experimental system.</w:t>
+        <w:t>. The physical implementation of the controller will be carried out in the near future to fully confirm and validate the approach on the experimental system.</w:t>
       </w:r>
     </w:p>
     <w:p>
       <w:pPr>
-        <w:pStyle w:val="BodyText"/>
+        <w:pStyle w:val="Corpodetexto"/>
       </w:pPr>
       <w:r>
         <w:t xml:space="preserve">This </w:t>
@@ -2718,12 +2528,12 @@
     </w:p>
     <w:p>
       <w:pPr>
-        <w:pStyle w:val="BodyText"/>
+        <w:pStyle w:val="Corpodetexto"/>
       </w:pPr>
     </w:p>
     <w:p>
       <w:pPr>
-        <w:pStyle w:val="Heading1"/>
+        <w:pStyle w:val="Ttulo1"/>
         <w:rPr>
           <w:noProof w:val="0"/>
         </w:rPr>
@@ -2916,7 +2726,7 @@
     </w:p>
     <w:p>
       <w:pPr>
-        <w:pStyle w:val="BodyText"/>
+        <w:pStyle w:val="Corpodetexto"/>
         <w:keepNext/>
         <w:rPr>
           <w:rFonts w:eastAsia="Times New Roman"/>
@@ -3270,7 +3080,7 @@
     </w:p>
     <w:p>
       <w:pPr>
-        <w:pStyle w:val="BodyText"/>
+        <w:pStyle w:val="Corpodetexto"/>
         <w:keepNext/>
         <w:ind w:firstLine="0pt"/>
         <w:jc w:val="center"/>
@@ -3374,7 +3184,7 @@
           <w:lang w:val="en-US"/>
         </w:rPr>
         <w:drawing>
-          <wp:inline distT="0" distB="0" distL="0" distR="0" wp14:anchorId="5A464376" wp14:editId="051FFCA4">
+          <wp:inline distT="0" distB="0" distL="0" distR="0" wp14:anchorId="5A464376" wp14:editId="605ABE1E">
             <wp:extent cx="2227634" cy="2259054"/>
             <wp:effectExtent l="0" t="0" r="0" b="1905"/>
             <wp:docPr id="346759077" name="Imagem 3"/>
@@ -3569,7 +3379,7 @@
     </w:p>
     <w:p>
       <w:pPr>
-        <w:pStyle w:val="BodyText"/>
+        <w:pStyle w:val="Corpodetexto"/>
       </w:pPr>
       <w:r>
         <w:rPr>
@@ -3660,21 +3470,7 @@
         <w:rPr>
           <w:rFonts w:eastAsia="Times New Roman"/>
         </w:rPr>
-        <w:t xml:space="preserve"> physical limitations inherent to the equipment, namely </w:t>
-      </w:r>
-      <w:proofErr w:type="gramStart"/>
-      <w:r>
-        <w:rPr>
-          <w:rFonts w:eastAsia="Times New Roman"/>
-        </w:rPr>
-        <w:t>with regard to</w:t>
-      </w:r>
-      <w:proofErr w:type="gramEnd"/>
-      <w:r>
-        <w:rPr>
-          <w:rFonts w:eastAsia="Times New Roman"/>
-        </w:rPr>
-        <w:t xml:space="preserve"> the finite field of displacement, velocity and acceleration, must be duly considered during the tests.</w:t>
+        <w:t xml:space="preserve"> physical limitations inherent to the equipment, namely with regard to the finite field of displacement, velocity and acceleration, must be duly considered during the tests.</w:t>
       </w:r>
       <w:r>
         <w:rPr>
@@ -3763,7 +3559,7 @@
     </w:p>
     <w:p>
       <w:pPr>
-        <w:pStyle w:val="BodyText"/>
+        <w:pStyle w:val="Corpodetexto"/>
         <w:rPr>
           <w:rFonts w:eastAsia="Times New Roman"/>
           <w:lang w:val="en-US"/>
@@ -3804,21 +3600,12 @@
         </w:rPr>
         <w:t xml:space="preserve"> and, consists of: </w:t>
       </w:r>
-      <w:proofErr w:type="spellStart"/>
-      <w:r>
-        <w:rPr>
-          <w:rFonts w:eastAsia="Times New Roman"/>
-          <w:lang w:val="en-US"/>
-        </w:rPr>
-        <w:t>i</w:t>
-      </w:r>
-      <w:proofErr w:type="spellEnd"/>
-      <w:r>
-        <w:rPr>
-          <w:rFonts w:eastAsia="Times New Roman"/>
-          <w:lang w:val="en-US"/>
-        </w:rPr>
-        <w:t xml:space="preserve">) </w:t>
+      <w:r>
+        <w:rPr>
+          <w:rFonts w:eastAsia="Times New Roman"/>
+          <w:lang w:val="en-US"/>
+        </w:rPr>
+        <w:t xml:space="preserve">i) </w:t>
       </w:r>
       <w:r>
         <w:rPr>
@@ -3867,23 +3654,7 @@
           <w:rFonts w:eastAsia="Times New Roman"/>
           <w:lang w:val="en-US"/>
         </w:rPr>
-        <w:t xml:space="preserve"> a hardware rack comprising all required signal conditioning and control components, including sensor signal conditioners and a National Instruments PXI Real-Time Controller integrated with a </w:t>
-      </w:r>
-      <w:proofErr w:type="spellStart"/>
-      <w:r>
-        <w:rPr>
-          <w:rFonts w:eastAsia="Times New Roman"/>
-          <w:lang w:val="en-US"/>
-        </w:rPr>
-        <w:t>CompactRIO</w:t>
-      </w:r>
-      <w:proofErr w:type="spellEnd"/>
-      <w:r>
-        <w:rPr>
-          <w:rFonts w:eastAsia="Times New Roman"/>
-          <w:lang w:val="en-US"/>
-        </w:rPr>
-        <w:t xml:space="preserve"> system featuring a Virtex-5 FPGA, enabling autonomous real-time execution of control and acquisition tasks;</w:t>
+        <w:t xml:space="preserve"> a hardware rack comprising all required signal conditioning and control components, including sensor signal conditioners and a National Instruments PXI Real-Time Controller integrated with a CompactRIO system featuring a Virtex-5 FPGA, enabling autonomous real-time execution of control and acquisition tasks;</w:t>
       </w:r>
       <w:r>
         <w:rPr>
@@ -4026,23 +3797,7 @@
           <w:rFonts w:eastAsia="Times New Roman"/>
           <w:lang w:val="en-US"/>
         </w:rPr>
-        <w:t xml:space="preserve">, comprising: </w:t>
-      </w:r>
-      <w:proofErr w:type="spellStart"/>
-      <w:r>
-        <w:rPr>
-          <w:rFonts w:eastAsia="Times New Roman"/>
-          <w:lang w:val="en-US"/>
-        </w:rPr>
-        <w:t>i</w:t>
-      </w:r>
-      <w:proofErr w:type="spellEnd"/>
-      <w:r>
-        <w:rPr>
-          <w:rFonts w:eastAsia="Times New Roman"/>
-          <w:lang w:val="en-US"/>
-        </w:rPr>
-        <w:t>) a controller, for which both a PID</w:t>
+        <w:t>, comprising: i) a controller, for which both a PID</w:t>
       </w:r>
       <w:r>
         <w:rPr>
@@ -4224,23 +3979,7 @@
           <w:rFonts w:eastAsia="Times New Roman"/>
           <w:lang w:val="en-US"/>
         </w:rPr>
-        <w:t xml:space="preserve">The control strategy currently implemented at LNEC is the OLI control approach. For </w:t>
-      </w:r>
-      <w:proofErr w:type="gramStart"/>
-      <w:r>
-        <w:rPr>
-          <w:rFonts w:eastAsia="Times New Roman"/>
-          <w:lang w:val="en-US"/>
-        </w:rPr>
-        <w:t>the majority of</w:t>
-      </w:r>
-      <w:proofErr w:type="gramEnd"/>
-      <w:r>
-        <w:rPr>
-          <w:rFonts w:eastAsia="Times New Roman"/>
-          <w:lang w:val="en-US"/>
-        </w:rPr>
-        <w:t xml:space="preserve"> applications, the PI</w:t>
+        <w:t>The control strategy currently implemented at LNEC is the OLI control approach. For the majority of applications, the PI</w:t>
       </w:r>
       <w:r>
         <w:rPr>
@@ -4268,7 +4007,7 @@
     </w:p>
     <w:p>
       <w:pPr>
-        <w:pStyle w:val="Heading1"/>
+        <w:pStyle w:val="Ttulo1"/>
         <w:rPr>
           <w:noProof w:val="0"/>
         </w:rPr>
@@ -4282,7 +4021,7 @@
     </w:p>
     <w:p>
       <w:pPr>
-        <w:pStyle w:val="Heading2"/>
+        <w:pStyle w:val="Ttulo2"/>
         <w:rPr>
           <w:noProof w:val="0"/>
         </w:rPr>
@@ -4296,7 +4035,7 @@
     </w:p>
     <w:p>
       <w:pPr>
-        <w:pStyle w:val="BodyText"/>
+        <w:pStyle w:val="Corpodetexto"/>
         <w:rPr>
           <w:lang w:val="en-US"/>
         </w:rPr>
@@ -4588,7 +4327,6 @@
         </w:rPr>
         <w:t xml:space="preserve">t </w:t>
       </w:r>
-      <w:proofErr w:type="gramStart"/>
       <w:r>
         <w:rPr>
           <w:lang w:val="en-US"/>
@@ -4601,7 +4339,6 @@
         </w:rPr>
         <w:t>n</w:t>
       </w:r>
-      <w:proofErr w:type="gramEnd"/>
       <w:r>
         <w:rPr>
           <w:lang w:val="en-US"/>
@@ -4749,7 +4486,7 @@
     </w:p>
     <w:p>
       <w:pPr>
-        <w:pStyle w:val="Heading2"/>
+        <w:pStyle w:val="Ttulo2"/>
         <w:rPr>
           <w:noProof w:val="0"/>
         </w:rPr>
@@ -4763,7 +4500,7 @@
     </w:p>
     <w:p>
       <w:pPr>
-        <w:pStyle w:val="BodyText"/>
+        <w:pStyle w:val="Corpodetexto"/>
       </w:pPr>
       <w:r>
         <w:t>The</w:t>
@@ -4778,7 +4515,7 @@
         <w:t>needed</w:t>
       </w:r>
       <w:r>
-        <w:t xml:space="preserve"> for tunning the controllers</w:t>
+        <w:t xml:space="preserve"> for tuning the controllers</w:t>
       </w:r>
       <w:r>
         <w:t xml:space="preserve">. </w:t>
@@ -4832,11 +4569,7 @@
         <w:t>set with proportional gain</w:t>
       </w:r>
       <w:r>
-        <w:t xml:space="preserve"> </w:t>
-      </w:r>
-      <w:proofErr w:type="spellStart"/>
-      <w:r>
-        <w:t>K</w:t>
+        <w:t xml:space="preserve"> K</w:t>
       </w:r>
       <w:r>
         <w:rPr>
@@ -4844,7 +4577,6 @@
         </w:rPr>
         <w:t>p</w:t>
       </w:r>
-      <w:proofErr w:type="spellEnd"/>
       <w:r>
         <w:t>=10</w:t>
       </w:r>
@@ -4870,15 +4602,7 @@
         <w:t xml:space="preserve">. A </w:t>
       </w:r>
       <w:r>
-        <w:t xml:space="preserve">sampling period of 5 </w:t>
-      </w:r>
-      <w:proofErr w:type="spellStart"/>
-      <w:r>
-        <w:t>ms</w:t>
-      </w:r>
-      <w:proofErr w:type="spellEnd"/>
-      <w:r>
-        <w:t xml:space="preserve"> is used throughout</w:t>
+        <w:t>sampling period of 5 ms is used throughout</w:t>
       </w:r>
       <w:r>
         <w:t>.</w:t>
@@ -5310,7 +5034,7 @@
     </w:p>
     <w:p>
       <w:pPr>
-        <w:pStyle w:val="BodyText"/>
+        <w:pStyle w:val="Corpodetexto"/>
         <w:keepNext/>
         <w:ind w:firstLine="0pt"/>
       </w:pPr>
@@ -5409,6 +5133,7 @@
         </w:rPr>
         <w:t xml:space="preserve">, with </w:t>
       </w:r>
+      <w:commentRangeStart w:id="3"/>
       <w:r>
         <w:rPr>
           <w:i/>
@@ -5431,6 +5156,22 @@
           <w:noProof w:val="0"/>
           <w:lang w:val="en-GB"/>
         </w:rPr>
+        <w:t>C</w:t>
+      </w:r>
+      <w:commentRangeEnd w:id="3"/>
+      <w:r>
+        <w:rPr>
+          <w:rStyle w:val="Refdecomentrio"/>
+          <w:noProof w:val="0"/>
+          <w:lang w:val="en-GB"/>
+        </w:rPr>
+        <w:commentReference w:id="3"/>
+      </w:r>
+      <w:r>
+        <w:rPr>
+          <w:noProof w:val="0"/>
+          <w:lang w:val="en-GB"/>
+        </w:rPr>
         <w:t xml:space="preserve"> being a </w:t>
       </w:r>
       <w:r>
@@ -5513,7 +5254,45 @@
           <w:noProof w:val="0"/>
           <w:lang w:val="en-GB"/>
         </w:rPr>
-        <w:t xml:space="preserve"> – sensibility function; </w:t>
+        <w:t xml:space="preserve"> – </w:t>
+      </w:r>
+      <w:commentRangeStart w:id="4"/>
+      <w:r>
+        <w:rPr>
+          <w:noProof w:val="0"/>
+          <w:lang w:val="en-GB"/>
+        </w:rPr>
+        <w:t>sensi</w:t>
+      </w:r>
+      <w:r>
+        <w:rPr>
+          <w:noProof w:val="0"/>
+          <w:lang w:val="en-GB"/>
+        </w:rPr>
+        <w:t>tivi</w:t>
+      </w:r>
+      <w:r>
+        <w:rPr>
+          <w:noProof w:val="0"/>
+          <w:lang w:val="en-GB"/>
+        </w:rPr>
+        <w:t>ty</w:t>
+      </w:r>
+      <w:commentRangeEnd w:id="4"/>
+      <w:r>
+        <w:rPr>
+          <w:rStyle w:val="Refdecomentrio"/>
+          <w:noProof w:val="0"/>
+          <w:lang w:val="en-GB"/>
+        </w:rPr>
+        <w:commentReference w:id="4"/>
+      </w:r>
+      <w:r>
+        <w:rPr>
+          <w:noProof w:val="0"/>
+          <w:lang w:val="en-GB"/>
+        </w:rPr>
+        <w:t xml:space="preserve"> function; </w:t>
       </w:r>
       <w:r>
         <w:rPr>
@@ -5579,7 +5358,6 @@
         </w:rPr>
         <w:t xml:space="preserve"> – white noise; </w:t>
       </w:r>
-      <w:proofErr w:type="spellStart"/>
       <w:r>
         <w:rPr>
           <w:i/>
@@ -5595,16 +5373,7 @@
           <w:vertAlign w:val="subscript"/>
           <w:lang w:val="en-GB"/>
         </w:rPr>
-        <w:t>r</w:t>
-      </w:r>
-      <w:proofErr w:type="spellEnd"/>
-      <w:r>
-        <w:rPr>
-          <w:noProof w:val="0"/>
-          <w:vertAlign w:val="subscript"/>
-          <w:lang w:val="en-GB"/>
-        </w:rPr>
-        <w:t xml:space="preserve"> </w:t>
+        <w:t xml:space="preserve">r </w:t>
       </w:r>
       <w:r>
         <w:rPr>
@@ -5623,7 +5392,7 @@
     </w:p>
     <w:p>
       <w:pPr>
-        <w:pStyle w:val="Heading2"/>
+        <w:pStyle w:val="Ttulo2"/>
         <w:rPr>
           <w:noProof w:val="0"/>
         </w:rPr>
@@ -5637,7 +5406,7 @@
     </w:p>
     <w:p>
       <w:pPr>
-        <w:pStyle w:val="BodyText"/>
+        <w:pStyle w:val="Corpodetexto"/>
       </w:pPr>
       <w:r>
         <w:rPr>
@@ -5654,7 +5423,7 @@
     </w:p>
     <w:p>
       <w:pPr>
-        <w:pStyle w:val="BodyText"/>
+        <w:pStyle w:val="Corpodetexto"/>
       </w:pPr>
       <w:r>
         <w:t xml:space="preserve">This method </w:t>
@@ -5836,7 +5605,7 @@
     </w:p>
     <w:p>
       <w:pPr>
-        <w:pStyle w:val="BodyText"/>
+        <w:pStyle w:val="Corpodetexto"/>
       </w:pPr>
       <w:r>
         <w:t>The closed-loop transfer function used in the</w:t>
@@ -5859,7 +5628,7 @@
     </w:p>
     <w:p>
       <w:pPr>
-        <w:pStyle w:val="BodyText"/>
+        <w:pStyle w:val="Corpodetexto"/>
       </w:pPr>
       <w:r>
         <w:rPr>
@@ -5958,7 +5727,7 @@
         <w:t xml:space="preserve"> an extension of the existing controller structure</w:t>
       </w:r>
       <w:r>
-        <w:t>, and allows more tuneability</w:t>
+        <w:t>, and allows more tunability</w:t>
       </w:r>
       <w:r>
         <w:t xml:space="preserve">. </w:t>
@@ -5975,7 +5744,7 @@
     </w:p>
     <w:p>
       <w:pPr>
-        <w:pStyle w:val="BodyText"/>
+        <w:pStyle w:val="Corpodetexto"/>
       </w:pPr>
       <w:r>
         <w:t>The simulations with the PID-F controller use the plant model resulting from the two-stage identification and the controller itself to close the loop.</w:t>
@@ -5983,7 +5752,7 @@
     </w:p>
     <w:p>
       <w:pPr>
-        <w:pStyle w:val="BodyText"/>
+        <w:pStyle w:val="Corpodetexto"/>
       </w:pPr>
       <w:r>
         <w:rPr>
@@ -6027,7 +5796,7 @@
     </w:p>
     <w:p>
       <w:pPr>
-        <w:pStyle w:val="BodyText"/>
+        <w:pStyle w:val="Corpodetexto"/>
       </w:pPr>
       <w:r>
         <w:t xml:space="preserve"> </w:t>
@@ -6249,7 +6018,7 @@
     </w:p>
     <w:p>
       <w:pPr>
-        <w:pStyle w:val="BodyText"/>
+        <w:pStyle w:val="Corpodetexto"/>
         <w:ind w:firstLine="0pt"/>
       </w:pPr>
       <w:r>
@@ -6292,11 +6061,7 @@
         <w:t>i</w:t>
       </w:r>
       <w:r>
-        <w:t>(t</w:t>
-      </w:r>
-      <w:proofErr w:type="gramStart"/>
-      <w:r>
-        <w:t>)]</w:t>
+        <w:t>(t)]</w:t>
       </w:r>
       <w:r>
         <w:rPr>
@@ -6304,7 +6069,6 @@
         </w:rPr>
         <w:t>T</w:t>
       </w:r>
-      <w:proofErr w:type="gramEnd"/>
       <w:r>
         <w:t>, with x</w:t>
       </w:r>
@@ -6323,7 +6087,7 @@
     </w:p>
     <w:p>
       <w:pPr>
-        <w:pStyle w:val="BodyText"/>
+        <w:pStyle w:val="Corpodetexto"/>
         <w:ind w:firstLine="0pt"/>
       </w:pPr>
       <w:r>
@@ -6338,7 +6102,7 @@
     </w:p>
     <w:p>
       <w:pPr>
-        <w:pStyle w:val="Heading2"/>
+        <w:pStyle w:val="Ttulo2"/>
         <w:rPr>
           <w:noProof w:val="0"/>
         </w:rPr>
@@ -6364,7 +6128,7 @@
     </w:p>
     <w:p>
       <w:pPr>
-        <w:pStyle w:val="BodyText"/>
+        <w:pStyle w:val="Corpodetexto"/>
       </w:pPr>
       <w:r>
         <w:t>A</w:t>
@@ -6394,31 +6158,7 @@
         <w:fldChar w:fldCharType="end"/>
       </w:r>
       <w:r>
-        <w:t xml:space="preserve">: </w:t>
-      </w:r>
-      <w:proofErr w:type="spellStart"/>
-      <w:r>
-        <w:t>i</w:t>
-      </w:r>
-      <w:proofErr w:type="spellEnd"/>
-      <w:r>
-        <w:t xml:space="preserve">) 1940 Imperial Valley earthquake, El Centro Fault Normal (FN) and Fault Parallel (FP) records; ii) 1992 </w:t>
-      </w:r>
-      <w:proofErr w:type="spellStart"/>
-      <w:r>
-        <w:t>Erzikan</w:t>
-      </w:r>
-      <w:proofErr w:type="spellEnd"/>
-      <w:r>
-        <w:t xml:space="preserve"> earthquake, </w:t>
-      </w:r>
-      <w:proofErr w:type="spellStart"/>
-      <w:r>
-        <w:t>Erzikan</w:t>
-      </w:r>
-      <w:proofErr w:type="spellEnd"/>
-      <w:r>
-        <w:t xml:space="preserve"> North-South (NS) and East-West (EW) record; iii) 1995 Kobe earthquake, Kobe NS and EW records; iv) 2009 L’Aquila earthquake; v) 1994 Northridge earthquake</w:t>
+        <w:t>: i) 1940 Imperial Valley earthquake, El Centro Fault Normal (FN) and Fault Parallel (FP) records; ii) 1992 Erzikan earthquake, Erzikan North-South (NS) and East-West (EW) record; iii) 1995 Kobe earthquake, Kobe NS and EW records; iv) 2009 L’Aquila earthquake; v) 1994 Northridge earthquake</w:t>
       </w:r>
       <w:r>
         <w:t>, Newhall</w:t>
@@ -6528,12 +6268,12 @@
     </w:p>
     <w:p>
       <w:pPr>
-        <w:pStyle w:val="BodyText"/>
+        <w:pStyle w:val="Corpodetexto"/>
       </w:pPr>
     </w:p>
     <w:p>
       <w:pPr>
-        <w:pStyle w:val="Heading1"/>
+        <w:pStyle w:val="Ttulo1"/>
         <w:rPr>
           <w:noProof w:val="0"/>
         </w:rPr>
@@ -6547,7 +6287,7 @@
     </w:p>
     <w:p>
       <w:pPr>
-        <w:pStyle w:val="Heading2"/>
+        <w:pStyle w:val="Ttulo2"/>
         <w:rPr>
           <w:noProof w:val="0"/>
         </w:rPr>
@@ -6562,12 +6302,12 @@
         <w:rPr>
           <w:noProof w:val="0"/>
         </w:rPr>
-        <w:t xml:space="preserve"> &amp; controller tunning</w:t>
+        <w:t xml:space="preserve"> &amp; controller tuning</w:t>
       </w:r>
     </w:p>
     <w:p>
       <w:pPr>
-        <w:pStyle w:val="BodyText"/>
+        <w:pStyle w:val="Corpodetexto"/>
         <w:ind w:firstLine="0pt"/>
       </w:pPr>
       <w:r>
@@ -6591,7 +6331,7 @@
     </w:p>
     <w:p>
       <w:pPr>
-        <w:pStyle w:val="BodyText"/>
+        <w:pStyle w:val="Corpodetexto"/>
         <w:ind w:firstLine="0pt"/>
         <w:jc w:val="center"/>
       </w:pPr>
@@ -6626,7 +6366,7 @@
                     </pic:cNvPicPr>
                   </pic:nvPicPr>
                   <pic:blipFill rotWithShape="1">
-                    <a:blip r:embed="rId14">
+                    <a:blip r:embed="rId18">
                       <a:extLst>
                         <a:ext uri="{28A0092B-C50C-407E-A947-70E740481C1C}">
                           <a14:useLocalDpi xmlns:a14="http://schemas.microsoft.com/office/drawing/2010/main" val="0"/>
@@ -6674,7 +6414,7 @@
           <w:lang w:val="en-GB"/>
         </w:rPr>
       </w:pPr>
-      <w:bookmarkStart w:id="3" w:name="_Ref228495219"/>
+      <w:bookmarkStart w:id="5" w:name="_Ref228495219"/>
       <w:r>
         <w:rPr>
           <w:noProof w:val="0"/>
@@ -6682,7 +6422,7 @@
         </w:rPr>
         <w:t>Shaking table control loop frequency response</w:t>
       </w:r>
-      <w:bookmarkEnd w:id="3"/>
+      <w:bookmarkEnd w:id="5"/>
       <w:r>
         <w:rPr>
           <w:noProof w:val="0"/>
@@ -6700,7 +6440,7 @@
     </w:p>
     <w:p>
       <w:pPr>
-        <w:pStyle w:val="BodyText"/>
+        <w:pStyle w:val="Corpodetexto"/>
         <w:ind w:firstLine="0pt"/>
       </w:pPr>
       <w:r>
@@ -6762,13 +6502,13 @@
     </w:p>
     <w:p>
       <w:pPr>
-        <w:pStyle w:val="BodyText"/>
+        <w:pStyle w:val="Corpodetexto"/>
         <w:ind w:firstLine="0pt"/>
       </w:pPr>
     </w:p>
     <w:p>
       <w:pPr>
-        <w:pStyle w:val="Heading2"/>
+        <w:pStyle w:val="Ttulo2"/>
         <w:rPr>
           <w:noProof w:val="0"/>
         </w:rPr>
@@ -6782,7 +6522,7 @@
     </w:p>
     <w:p>
       <w:pPr>
-        <w:pStyle w:val="BodyText"/>
+        <w:pStyle w:val="Corpodetexto"/>
         <w:ind w:firstLine="0pt"/>
       </w:pPr>
       <w:r>
@@ -6851,8 +6591,27 @@
       <w:r>
         <w:t xml:space="preserve"> </w:t>
       </w:r>
-      <w:r>
-        <w:t>of Tolmezzo earthquake, respectively</w:t>
+      <w:commentRangeStart w:id="6"/>
+      <w:r>
+        <w:t>of</w:t>
+      </w:r>
+      <w:commentRangeEnd w:id="6"/>
+      <w:r>
+        <w:rPr>
+          <w:rStyle w:val="Refdecomentrio"/>
+          <w:sz w:val="20"/>
+          <w:szCs w:val="20"/>
+        </w:rPr>
+        <w:commentReference w:id="6"/>
+      </w:r>
+      <w:r>
+        <w:t xml:space="preserve"> </w:t>
+      </w:r>
+      <w:r>
+        <w:t>Newhall</w:t>
+      </w:r>
+      <w:r>
+        <w:t xml:space="preserve"> earthquake, respectively</w:t>
       </w:r>
       <w:r>
         <w:t xml:space="preserve">, </w:t>
@@ -6869,7 +6628,7 @@
     </w:p>
     <w:p>
       <w:pPr>
-        <w:pStyle w:val="BodyText"/>
+        <w:pStyle w:val="Corpodetexto"/>
         <w:ind w:firstLine="0pt"/>
       </w:pPr>
       <w:r>
@@ -6890,7 +6649,7 @@
     </w:p>
     <w:p>
       <w:pPr>
-        <w:pStyle w:val="BodyText"/>
+        <w:pStyle w:val="Corpodetexto"/>
         <w:ind w:firstLine="0pt"/>
       </w:pPr>
     </w:p>
@@ -6974,7 +6733,7 @@
                     </pic:cNvPicPr>
                   </pic:nvPicPr>
                   <pic:blipFill>
-                    <a:blip r:embed="rId15" cstate="print">
+                    <a:blip r:embed="rId19" cstate="print">
                       <a:extLst>
                         <a:ext uri="{28A0092B-C50C-407E-A947-70E740481C1C}">
                           <a14:useLocalDpi xmlns:a14="http://schemas.microsoft.com/office/drawing/2010/main" val="0"/>
@@ -7024,7 +6783,7 @@
           <w:lang w:val="en-GB"/>
         </w:rPr>
       </w:pPr>
-      <w:bookmarkStart w:id="4" w:name="_Ref228496414"/>
+      <w:bookmarkStart w:id="7" w:name="_Ref228496414"/>
       <w:r>
         <w:rPr>
           <w:noProof w:val="0"/>
@@ -7081,7 +6840,7 @@
         </w:rPr>
         <w:t>seismic signal</w:t>
       </w:r>
-      <w:bookmarkEnd w:id="4"/>
+      <w:bookmarkEnd w:id="7"/>
     </w:p>
     <w:p>
       <w:pPr>
@@ -7118,7 +6877,7 @@
                     </pic:cNvPicPr>
                   </pic:nvPicPr>
                   <pic:blipFill>
-                    <a:blip r:embed="rId16" cstate="print">
+                    <a:blip r:embed="rId20" cstate="print">
                       <a:extLst>
                         <a:ext uri="{28A0092B-C50C-407E-A947-70E740481C1C}">
                           <a14:useLocalDpi xmlns:a14="http://schemas.microsoft.com/office/drawing/2010/main" val="0"/>
@@ -7161,7 +6920,7 @@
           <w:lang w:val="en-GB"/>
         </w:rPr>
       </w:pPr>
-      <w:bookmarkStart w:id="5" w:name="_Ref228496418"/>
+      <w:bookmarkStart w:id="8" w:name="_Ref228496418"/>
       <w:r>
         <w:rPr>
           <w:noProof w:val="0"/>
@@ -7218,7 +6977,7 @@
         </w:rPr>
         <w:t>seismic signal</w:t>
       </w:r>
-      <w:bookmarkEnd w:id="5"/>
+      <w:bookmarkEnd w:id="8"/>
     </w:p>
     <w:p>
       <w:pPr>
@@ -7284,7 +7043,7 @@
                     </pic:cNvPicPr>
                   </pic:nvPicPr>
                   <pic:blipFill>
-                    <a:blip r:embed="rId17" cstate="print">
+                    <a:blip r:embed="rId21" cstate="print">
                       <a:extLst>
                         <a:ext uri="{28A0092B-C50C-407E-A947-70E740481C1C}">
                           <a14:useLocalDpi xmlns:a14="http://schemas.microsoft.com/office/drawing/2010/main" val="0"/>
@@ -7387,7 +7146,7 @@
                     </pic:cNvPicPr>
                   </pic:nvPicPr>
                   <pic:blipFill>
-                    <a:blip r:embed="rId18" cstate="print">
+                    <a:blip r:embed="rId22" cstate="print">
                       <a:extLst>
                         <a:ext uri="{28A0092B-C50C-407E-A947-70E740481C1C}">
                           <a14:useLocalDpi xmlns:a14="http://schemas.microsoft.com/office/drawing/2010/main" val="0"/>
@@ -7430,7 +7189,7 @@
           <w:lang w:val="en-GB"/>
         </w:rPr>
       </w:pPr>
-      <w:bookmarkStart w:id="6" w:name="_Ref228497348"/>
+      <w:bookmarkStart w:id="9" w:name="_Ref228497348"/>
       <w:r>
         <w:rPr>
           <w:noProof w:val="0"/>
@@ -7452,7 +7211,7 @@
         </w:rPr>
         <w:t>spectrum performance</w:t>
       </w:r>
-      <w:bookmarkEnd w:id="6"/>
+      <w:bookmarkEnd w:id="9"/>
       <w:r>
         <w:rPr>
           <w:noProof w:val="0"/>
@@ -7476,7 +7235,7 @@
     </w:p>
     <w:p>
       <w:pPr>
-        <w:pStyle w:val="Heading1"/>
+        <w:pStyle w:val="Ttulo1"/>
         <w:ind w:firstLine="0pt"/>
         <w:rPr>
           <w:noProof w:val="0"/>
@@ -7492,7 +7251,7 @@
     </w:p>
     <w:p>
       <w:pPr>
-        <w:pStyle w:val="BodyText"/>
+        <w:pStyle w:val="Corpodetexto"/>
         <w:ind w:firstLine="0pt"/>
         <w:rPr>
           <w:lang w:val="en-US"/>
@@ -7501,7 +7260,7 @@
     </w:p>
     <w:p>
       <w:pPr>
-        <w:pStyle w:val="BodyText"/>
+        <w:pStyle w:val="Corpodetexto"/>
         <w:rPr>
           <w:lang w:val="en-US"/>
         </w:rPr>
@@ -7653,7 +7412,7 @@
     </w:p>
     <w:p>
       <w:pPr>
-        <w:pStyle w:val="BodyText"/>
+        <w:pStyle w:val="Corpodetexto"/>
         <w:rPr>
           <w:lang w:val="en-US"/>
         </w:rPr>
@@ -7679,7 +7438,7 @@
     </w:p>
     <w:p>
       <w:pPr>
-        <w:pStyle w:val="BodyText"/>
+        <w:pStyle w:val="Corpodetexto"/>
         <w:rPr>
           <w:lang w:val="en-US"/>
         </w:rPr>
@@ -7777,7 +7536,7 @@
     </w:p>
     <w:p>
       <w:pPr>
-        <w:pStyle w:val="BodyText"/>
+        <w:pStyle w:val="Corpodetexto"/>
         <w:ind w:firstLine="0pt"/>
         <w:rPr>
           <w:u w:val="single"/>
@@ -7787,7 +7546,7 @@
     </w:p>
     <w:p>
       <w:pPr>
-        <w:pStyle w:val="Heading5"/>
+        <w:pStyle w:val="Ttulo5"/>
         <w:rPr>
           <w:noProof w:val="0"/>
         </w:rPr>
@@ -7802,7 +7561,7 @@
     <w:p/>
     <w:p>
       <w:pPr>
-        <w:pStyle w:val="BodyText"/>
+        <w:pStyle w:val="Corpodetexto"/>
         <w:rPr>
           <w:rFonts w:eastAsia="Times New Roman"/>
         </w:rPr>
@@ -7825,7 +7584,6 @@
       <w:r>
         <w:t xml:space="preserve"> research fellowship under the LNEC Research Programme </w:t>
       </w:r>
-      <w:proofErr w:type="spellStart"/>
       <w:r>
         <w:rPr>
           <w:i/>
@@ -7840,76 +7598,41 @@
         </w:rPr>
         <w:t>ção</w:t>
       </w:r>
-      <w:proofErr w:type="spellEnd"/>
       <w:r>
         <w:rPr>
           <w:i/>
           <w:iCs/>
         </w:rPr>
-        <w:t xml:space="preserve"> do </w:t>
-      </w:r>
-      <w:proofErr w:type="spellStart"/>
+        <w:t xml:space="preserve"> do Comportamento Estrutural- </w:t>
+      </w:r>
       <w:r>
         <w:rPr>
           <w:i/>
           <w:iCs/>
         </w:rPr>
-        <w:t>Comportamento</w:t>
-      </w:r>
-      <w:proofErr w:type="spellEnd"/>
+        <w:t>M</w:t>
+      </w:r>
       <w:r>
         <w:rPr>
           <w:i/>
           <w:iCs/>
         </w:rPr>
-        <w:t xml:space="preserve"> </w:t>
-      </w:r>
-      <w:proofErr w:type="spellStart"/>
-      <w:r>
-        <w:rPr>
+        <w:t>e</w:t>
+      </w:r>
+      <w:r>
+        <w:rPr>
+          <w:rFonts w:eastAsia="Times New Roman"/>
           <w:i/>
           <w:iCs/>
         </w:rPr>
-        <w:t>Estrutural</w:t>
-      </w:r>
-      <w:proofErr w:type="spellEnd"/>
-      <w:r>
-        <w:rPr>
+        <w:t>str</w:t>
+      </w:r>
+      <w:r>
+        <w:rPr>
+          <w:rFonts w:eastAsia="Times New Roman"/>
           <w:i/>
           <w:iCs/>
         </w:rPr>
-        <w:t xml:space="preserve">- </w:t>
-      </w:r>
-      <w:proofErr w:type="spellStart"/>
-      <w:r>
-        <w:rPr>
-          <w:i/>
-          <w:iCs/>
-        </w:rPr>
-        <w:t>M</w:t>
-      </w:r>
-      <w:r>
-        <w:rPr>
-          <w:i/>
-          <w:iCs/>
-        </w:rPr>
-        <w:t>e</w:t>
-      </w:r>
-      <w:r>
-        <w:rPr>
-          <w:rFonts w:eastAsia="Times New Roman"/>
-          <w:i/>
-          <w:iCs/>
-        </w:rPr>
-        <w:t>str</w:t>
-      </w:r>
-      <w:proofErr w:type="spellEnd"/>
-      <w:r>
-        <w:rPr>
-          <w:rFonts w:eastAsia="Times New Roman"/>
-          <w:i/>
-          <w:iCs/>
-        </w:rPr>
         <w:t xml:space="preserve">, </w:t>
       </w:r>
       <w:r>
@@ -7929,54 +7652,12 @@
         <w:rPr>
           <w:rFonts w:eastAsia="Times New Roman"/>
         </w:rPr>
-        <w:t xml:space="preserve"> </w:t>
-      </w:r>
-      <w:proofErr w:type="spellStart"/>
-      <w:r>
-        <w:rPr>
-          <w:rFonts w:eastAsia="Times New Roman"/>
-        </w:rPr>
-        <w:t>Fundação</w:t>
-      </w:r>
-      <w:proofErr w:type="spellEnd"/>
-      <w:r>
-        <w:rPr>
-          <w:rFonts w:eastAsia="Times New Roman"/>
-        </w:rPr>
-        <w:t xml:space="preserve"> para a </w:t>
-      </w:r>
-      <w:proofErr w:type="spellStart"/>
-      <w:r>
-        <w:rPr>
-          <w:rFonts w:eastAsia="Times New Roman"/>
-        </w:rPr>
-        <w:t>Ciência</w:t>
-      </w:r>
-      <w:proofErr w:type="spellEnd"/>
-      <w:r>
-        <w:rPr>
-          <w:rFonts w:eastAsia="Times New Roman"/>
-        </w:rPr>
-        <w:t xml:space="preserve"> e a </w:t>
-      </w:r>
-      <w:proofErr w:type="spellStart"/>
-      <w:r>
-        <w:rPr>
-          <w:rFonts w:eastAsia="Times New Roman"/>
-        </w:rPr>
-        <w:t>Tecnologia</w:t>
-      </w:r>
-      <w:proofErr w:type="spellEnd"/>
-      <w:r>
-        <w:rPr>
-          <w:rFonts w:eastAsia="Times New Roman"/>
-        </w:rPr>
-        <w:t xml:space="preserve"> (FCT) for its financial support via LAETA (project </w:t>
-      </w:r>
-      <w:hyperlink r:id="rId19" w:history="1">
+        <w:t xml:space="preserve"> Fundação para a Ciência e a Tecnologia (FCT) for its financial support via LAETA (project </w:t>
+      </w:r>
+      <w:hyperlink r:id="rId23" w:history="1">
         <w:r>
           <w:rPr>
-            <w:rStyle w:val="Hyperlink"/>
+            <w:rStyle w:val="Hiperligao"/>
             <w:rFonts w:eastAsia="Times New Roman"/>
           </w:rPr>
           <w:t>https://doi.org/10.54499/UID/50022/2025</w:t>
@@ -7997,7 +7678,7 @@
     </w:p>
     <w:p>
       <w:pPr>
-        <w:pStyle w:val="BodyText"/>
+        <w:pStyle w:val="Corpodetexto"/>
         <w:ind w:firstLine="0pt"/>
         <w:rPr>
           <w:rFonts w:eastAsia="Times New Roman"/>
@@ -8009,7 +7690,7 @@
     </w:p>
     <w:p>
       <w:pPr>
-        <w:pStyle w:val="BodyText"/>
+        <w:pStyle w:val="Corpodetexto"/>
         <w:ind w:firstLine="0pt"/>
         <w:rPr>
           <w:rFonts w:eastAsia="Times New Roman"/>
@@ -8021,7 +7702,7 @@
     </w:p>
     <w:p>
       <w:pPr>
-        <w:pStyle w:val="BodyText"/>
+        <w:pStyle w:val="Corpodetexto"/>
         <w:ind w:firstLine="0pt"/>
         <w:rPr>
           <w:rFonts w:eastAsia="Times New Roman"/>
@@ -8033,7 +7714,7 @@
     </w:p>
     <w:p>
       <w:pPr>
-        <w:pStyle w:val="BodyText"/>
+        <w:pStyle w:val="Corpodetexto"/>
         <w:ind w:firstLine="0pt"/>
         <w:rPr>
           <w:rFonts w:eastAsia="Times New Roman"/>
@@ -8045,7 +7726,7 @@
     </w:p>
     <w:p>
       <w:pPr>
-        <w:pStyle w:val="Heading5"/>
+        <w:pStyle w:val="Ttulo5"/>
         <w:rPr>
           <w:noProof w:val="0"/>
         </w:rPr>
@@ -8066,40 +7747,40 @@
           <w:lang w:val="en-GB"/>
         </w:rPr>
       </w:pPr>
-      <w:bookmarkStart w:id="7" w:name="_Ref228379249"/>
-      <w:r>
-        <w:rPr>
-          <w:noProof w:val="0"/>
-          <w:lang w:val="en-GB"/>
-        </w:rPr>
-        <w:t xml:space="preserve">S. J. Chapman, M. S. Williams, A. Blakeborough, “Laboratory testing of structures under dynamic loads: an introductory review”. </w:t>
-      </w:r>
-      <w:proofErr w:type="spellStart"/>
-      <w:r>
-        <w:rPr>
-          <w:noProof w:val="0"/>
-          <w:lang w:val="en-GB"/>
-        </w:rPr>
-        <w:t>Philos</w:t>
-      </w:r>
-      <w:proofErr w:type="spellEnd"/>
-      <w:r>
-        <w:rPr>
-          <w:noProof w:val="0"/>
-          <w:lang w:val="en-GB"/>
-        </w:rPr>
-        <w:t xml:space="preserve"> Trans A Math Phys Eng Sci; 359 (1786): 1651–1669, 15 September 2001. </w:t>
-      </w:r>
-      <w:hyperlink r:id="rId20">
+      <w:bookmarkStart w:id="10" w:name="_Ref228379249"/>
+      <w:r>
+        <w:rPr>
+          <w:noProof w:val="0"/>
+          <w:lang w:val="en-GB"/>
+        </w:rPr>
+        <w:t xml:space="preserve">S. J. Chapman, M. S. Williams, A. Blakeborough, “Laboratory testing of structures under dynamic loads: an introductory review”. Philos Trans A Math Phys Eng Sci; 359 (1786): 1651–1669, 15 September 2001. </w:t>
+      </w:r>
+      <w:hyperlink r:id="rId24">
         <w:r>
           <w:rPr>
-            <w:rStyle w:val="Hyperlink"/>
+            <w:rStyle w:val="Hiperligao"/>
             <w:noProof w:val="0"/>
             <w:lang w:val="en-GB"/>
           </w:rPr>
-          <w:t>https://doi.org/10.1098/rsta.2001.0860</w:t>
+          <w:t>https://doi.org/10.1098/rsta.200</w:t>
         </w:r>
-        <w:bookmarkEnd w:id="7"/>
+        <w:r>
+          <w:rPr>
+            <w:rStyle w:val="Hiperligao"/>
+            <w:noProof w:val="0"/>
+            <w:lang w:val="en-GB"/>
+          </w:rPr>
+          <w:t>1</w:t>
+        </w:r>
+        <w:r>
+          <w:rPr>
+            <w:rStyle w:val="Hiperligao"/>
+            <w:noProof w:val="0"/>
+            <w:lang w:val="en-GB"/>
+          </w:rPr>
+          <w:t>.0860</w:t>
+        </w:r>
+        <w:bookmarkEnd w:id="10"/>
       </w:hyperlink>
     </w:p>
     <w:p>
@@ -8110,7 +7791,7 @@
           <w:lang w:val="en-GB"/>
         </w:rPr>
       </w:pPr>
-      <w:bookmarkStart w:id="8" w:name="_Ref228379251"/>
+      <w:bookmarkStart w:id="11" w:name="_Ref228379251"/>
       <w:r>
         <w:rPr>
           <w:noProof w:val="0"/>
@@ -8131,142 +7812,6 @@
           <w:lang w:val="en-GB"/>
         </w:rPr>
         <w:t xml:space="preserve"> Earthquake Engineering, Balkema, Rotterdam, 1998.</w:t>
-      </w:r>
-      <w:bookmarkEnd w:id="8"/>
-    </w:p>
-    <w:p>
-      <w:pPr>
-        <w:pStyle w:val="references"/>
-        <w:rPr>
-          <w:noProof w:val="0"/>
-          <w:lang w:val="en-GB"/>
-        </w:rPr>
-      </w:pPr>
-      <w:bookmarkStart w:id="9" w:name="_Ref228381111"/>
-      <w:r>
-        <w:rPr>
-          <w:noProof w:val="0"/>
-          <w:lang w:val="en-GB"/>
-        </w:rPr>
-        <w:t xml:space="preserve">P. X. Candeias, A. A. Correia, G. G. Tekeste, “Shake Table Testing Techniques: Current Challenges and New Trends,” In: </w:t>
-      </w:r>
-      <w:proofErr w:type="spellStart"/>
-      <w:r>
-        <w:rPr>
-          <w:noProof w:val="0"/>
-          <w:lang w:val="en-GB"/>
-        </w:rPr>
-        <w:t>Chastre</w:t>
-      </w:r>
-      <w:proofErr w:type="spellEnd"/>
-      <w:r>
-        <w:rPr>
-          <w:noProof w:val="0"/>
-          <w:lang w:val="en-GB"/>
-        </w:rPr>
-        <w:t xml:space="preserve">, C., Neves, J., Ribeiro, D., Neves, M.G., Faria, P. (eds) Advances on Testing and Experimentation in Civil Engineering. Springer Tracts in Civil Engineering. Springer, </w:t>
-      </w:r>
-      <w:r>
-        <w:rPr>
-          <w:noProof w:val="0"/>
-          <w:lang w:val="en-GB"/>
-        </w:rPr>
-        <w:t>2023</w:t>
-      </w:r>
-      <w:r>
-        <w:rPr>
-          <w:noProof w:val="0"/>
-          <w:lang w:val="en-GB"/>
-        </w:rPr>
-        <w:t xml:space="preserve">. </w:t>
-      </w:r>
-      <w:bookmarkEnd w:id="9"/>
-      <w:r>
-        <w:fldChar w:fldCharType="begin"/>
-      </w:r>
-      <w:r>
-        <w:instrText>HYPERLINK "https://doi.org/10.1007/978-3-031-23888-8_8" \h</w:instrText>
-      </w:r>
-      <w:r>
-        <w:fldChar w:fldCharType="separate"/>
-      </w:r>
-      <w:r>
-        <w:rPr>
-          <w:rStyle w:val="Hyperlink"/>
-          <w:noProof w:val="0"/>
-          <w:lang w:val="en-GB"/>
-        </w:rPr>
-        <w:t>https://doi.org/10.1007/978-3-031-23888-8_8</w:t>
-      </w:r>
-      <w:r>
-        <w:fldChar w:fldCharType="end"/>
-      </w:r>
-    </w:p>
-    <w:p>
-      <w:pPr>
-        <w:pStyle w:val="references"/>
-        <w:rPr>
-          <w:noProof w:val="0"/>
-          <w:lang w:val="en-GB"/>
-        </w:rPr>
-      </w:pPr>
-      <w:bookmarkStart w:id="10" w:name="_Ref228380040"/>
-      <w:r>
-        <w:rPr>
-          <w:noProof w:val="0"/>
-          <w:lang w:val="en-GB"/>
-        </w:rPr>
-        <w:t xml:space="preserve">T. Emílio, R. T. Duarte, F. Carvalhal, C. O. Costa, C. T. Vaz, M. R. Corrêa, </w:t>
-      </w:r>
-      <w:proofErr w:type="gramStart"/>
-      <w:r>
-        <w:rPr>
-          <w:noProof w:val="0"/>
-          <w:lang w:val="en-GB"/>
-        </w:rPr>
-        <w:t>The</w:t>
-      </w:r>
-      <w:proofErr w:type="gramEnd"/>
-      <w:r>
-        <w:rPr>
-          <w:noProof w:val="0"/>
-          <w:lang w:val="en-GB"/>
-        </w:rPr>
-        <w:t xml:space="preserve"> new LNEC shaking table for earthquake resistance testing”, </w:t>
-      </w:r>
-      <w:proofErr w:type="spellStart"/>
-      <w:r>
-        <w:rPr>
-          <w:noProof w:val="0"/>
-          <w:lang w:val="en-GB"/>
-        </w:rPr>
-        <w:t>Memória</w:t>
-      </w:r>
-      <w:proofErr w:type="spellEnd"/>
-      <w:r>
-        <w:rPr>
-          <w:noProof w:val="0"/>
-          <w:lang w:val="en-GB"/>
-        </w:rPr>
-        <w:t xml:space="preserve"> 757, LNEC, Lisboa, 1989.</w:t>
-      </w:r>
-      <w:bookmarkEnd w:id="10"/>
-    </w:p>
-    <w:p>
-      <w:pPr>
-        <w:pStyle w:val="references"/>
-        <w:rPr>
-          <w:noProof w:val="0"/>
-          <w:lang w:val="pt-PT"/>
-        </w:rPr>
-      </w:pPr>
-      <w:bookmarkStart w:id="11" w:name="_Ref228380530"/>
-      <w:r>
-        <w:rPr>
-          <w:noProof w:val="0"/>
-          <w:lang w:val="pt-PT"/>
-        </w:rPr>
-        <w:t>R. Bairrão, Duque, Simulador Sísmico Uniaxial - Descrição e operação, Relatório LNEC, 94/1998 - C3ES/SES, LNEC, Lisboa, 1998.</w:t>
       </w:r>
       <w:bookmarkEnd w:id="11"/>
     </w:p>
@@ -8275,34 +7820,52 @@
         <w:pStyle w:val="references"/>
         <w:rPr>
           <w:noProof w:val="0"/>
-          <w:lang w:val="pt-PT"/>
-        </w:rPr>
-      </w:pPr>
-      <w:bookmarkStart w:id="12" w:name="_Ref228380531"/>
-      <w:r>
-        <w:rPr>
-          <w:noProof w:val="0"/>
-          <w:lang w:val="pt-PT"/>
-        </w:rPr>
-        <w:t xml:space="preserve">P. Castro, Mesa Vibratória Vertical (Projeto), Relatório LNEC, Obra 76/53/1077, LNEC, Lisboa, </w:t>
-      </w:r>
-      <w:proofErr w:type="spellStart"/>
-      <w:r>
-        <w:rPr>
-          <w:noProof w:val="0"/>
-          <w:lang w:val="pt-PT"/>
-        </w:rPr>
-        <w:t>June</w:t>
-      </w:r>
-      <w:proofErr w:type="spellEnd"/>
-      <w:r>
-        <w:rPr>
-          <w:noProof w:val="0"/>
-          <w:lang w:val="pt-PT"/>
-        </w:rPr>
-        <w:t xml:space="preserve"> 1978.</w:t>
+          <w:lang w:val="en-GB"/>
+        </w:rPr>
+      </w:pPr>
+      <w:bookmarkStart w:id="12" w:name="_Ref228381111"/>
+      <w:r>
+        <w:rPr>
+          <w:noProof w:val="0"/>
+          <w:lang w:val="en-GB"/>
+        </w:rPr>
+        <w:t xml:space="preserve">P. X. Candeias, A. A. Correia, G. G. Tekeste, “Shake Table Testing Techniques: Current Challenges and New Trends,” In: Chastre, C., Neves, J., Ribeiro, D., Neves, M.G., Faria, P. (eds) Advances on Testing and Experimentation in Civil Engineering. Springer Tracts in Civil Engineering. Springer, </w:t>
+      </w:r>
+      <w:r>
+        <w:rPr>
+          <w:noProof w:val="0"/>
+          <w:lang w:val="en-GB"/>
+        </w:rPr>
+        <w:t>2023</w:t>
+      </w:r>
+      <w:r>
+        <w:rPr>
+          <w:noProof w:val="0"/>
+          <w:lang w:val="en-GB"/>
+        </w:rPr>
+        <w:t xml:space="preserve">. </w:t>
       </w:r>
       <w:bookmarkEnd w:id="12"/>
+      <w:r>
+        <w:fldChar w:fldCharType="begin"/>
+      </w:r>
+      <w:r>
+        <w:instrText>HYPERLINK "https://doi.org/10.1007/978-3-031-23888-8_8" \h</w:instrText>
+      </w:r>
+      <w:r>
+        <w:fldChar w:fldCharType="separate"/>
+      </w:r>
+      <w:r>
+        <w:rPr>
+          <w:rStyle w:val="Hiperligao"/>
+          <w:noProof w:val="0"/>
+          <w:lang w:val="en-GB"/>
+        </w:rPr>
+        <w:t>https://doi.org/10.1007/978-3-031-23888-8_8</w:t>
+      </w:r>
+      <w:r>
+        <w:fldChar w:fldCharType="end"/>
+      </w:r>
     </w:p>
     <w:p>
       <w:pPr>
@@ -8312,13 +7875,13 @@
           <w:lang w:val="en-GB"/>
         </w:rPr>
       </w:pPr>
-      <w:bookmarkStart w:id="13" w:name="_Ref228403345"/>
-      <w:r>
-        <w:rPr>
-          <w:noProof w:val="0"/>
-          <w:lang w:val="en-GB"/>
-        </w:rPr>
-        <w:t>F. Carvalhal, Simulation of Seismic Disturbances Using Adaptive Control, MSc Thesis, Victoria University of Manchester, Institute of Science and Technology, October 1974.</w:t>
+      <w:bookmarkStart w:id="13" w:name="_Ref228380040"/>
+      <w:r>
+        <w:rPr>
+          <w:noProof w:val="0"/>
+          <w:lang w:val="en-GB"/>
+        </w:rPr>
+        <w:t>T. Emílio, R. T. Duarte, F. Carvalhal, C. O. Costa, C. T. Vaz, M. R. Corrêa, The new LNEC shaking table for earthquake resistance testing”, Memória 757, LNEC, Lisboa, 1989.</w:t>
       </w:r>
       <w:bookmarkEnd w:id="13"/>
     </w:p>
@@ -8330,43 +7893,13 @@
           <w:lang w:val="pt-PT"/>
         </w:rPr>
       </w:pPr>
-      <w:bookmarkStart w:id="14" w:name="_Ref228403347"/>
+      <w:bookmarkStart w:id="14" w:name="_Ref228380530"/>
       <w:r>
         <w:rPr>
           <w:noProof w:val="0"/>
           <w:lang w:val="pt-PT"/>
         </w:rPr>
-        <w:t xml:space="preserve">F. Carvalhal, Controlo Adaptativo na Simulação de Solicitações Sísmicas, Tese para Especialista LNEC, STG/DPA, Proc. 76/13/5588, Lisboa, </w:t>
-      </w:r>
-      <w:proofErr w:type="spellStart"/>
-      <w:r>
-        <w:rPr>
-          <w:noProof w:val="0"/>
-          <w:lang w:val="pt-PT"/>
-        </w:rPr>
-        <w:t>Ja</w:t>
-      </w:r>
-      <w:r>
-        <w:rPr>
-          <w:noProof w:val="0"/>
-          <w:lang w:val="pt-PT"/>
-        </w:rPr>
-        <w:t>nuary</w:t>
-      </w:r>
-      <w:proofErr w:type="spellEnd"/>
-      <w:r>
-        <w:rPr>
-          <w:noProof w:val="0"/>
-          <w:lang w:val="pt-PT"/>
-        </w:rPr>
-        <w:t xml:space="preserve"> </w:t>
-      </w:r>
-      <w:r>
-        <w:rPr>
-          <w:noProof w:val="0"/>
-          <w:lang w:val="pt-PT"/>
-        </w:rPr>
-        <w:t>1979.</w:t>
+        <w:t>R. Bairrão, Duque, Simulador Sísmico Uniaxial - Descrição e operação, Relatório LNEC, 94/1998 - C3ES/SES, LNEC, Lisboa, 1998.</w:t>
       </w:r>
       <w:bookmarkEnd w:id="14"/>
     </w:p>
@@ -8375,48 +7908,49 @@
         <w:pStyle w:val="references"/>
         <w:rPr>
           <w:noProof w:val="0"/>
-          <w:lang w:val="en-GB"/>
-        </w:rPr>
-      </w:pPr>
-      <w:bookmarkStart w:id="15" w:name="_Ref228403730"/>
-      <w:r>
-        <w:rPr>
-          <w:noProof w:val="0"/>
-          <w:lang w:val="en-GB"/>
-        </w:rPr>
-        <w:t>K. Ogata, Modern Control Engineering. 5th Edition, Pearson, Upper Saddle River, 2010.</w:t>
+          <w:lang w:val="pt-PT"/>
+        </w:rPr>
+      </w:pPr>
+      <w:bookmarkStart w:id="15" w:name="_Ref228380531"/>
+      <w:r>
+        <w:rPr>
+          <w:noProof w:val="0"/>
+          <w:lang w:val="pt-PT"/>
+        </w:rPr>
+        <w:t xml:space="preserve">P. Castro, Mesa Vibratória Vertical (Projeto), Relatório LNEC, Obra 76/53/1077, LNEC, Lisboa, </w:t>
+      </w:r>
+      <w:r>
+        <w:rPr>
+          <w:noProof w:val="0"/>
+          <w:lang w:val="pt-PT"/>
+        </w:rPr>
+        <w:t>June</w:t>
+      </w:r>
+      <w:r>
+        <w:rPr>
+          <w:noProof w:val="0"/>
+          <w:lang w:val="pt-PT"/>
+        </w:rPr>
+        <w:t xml:space="preserve"> 1978.</w:t>
       </w:r>
       <w:bookmarkEnd w:id="15"/>
     </w:p>
     <w:p>
       <w:pPr>
         <w:pStyle w:val="references"/>
-      </w:pPr>
-      <w:bookmarkStart w:id="16" w:name="_Ref228386698"/>
-      <w:r>
-        <w:rPr>
-          <w:noProof w:val="0"/>
-          <w:lang w:val="en-GB"/>
-        </w:rPr>
-        <w:t xml:space="preserve">B. </w:t>
-      </w:r>
-      <w:proofErr w:type="spellStart"/>
-      <w:r>
-        <w:rPr>
-          <w:noProof w:val="0"/>
-          <w:lang w:val="en-GB"/>
-        </w:rPr>
-        <w:t>Widrow</w:t>
-      </w:r>
-      <w:proofErr w:type="spellEnd"/>
-      <w:r>
-        <w:rPr>
-          <w:noProof w:val="0"/>
-          <w:lang w:val="en-GB"/>
-        </w:rPr>
-        <w:t>, E. Walach, Adaptive Inverse Control: A Signal Processing Approach, Institute of Electrical and Electronic Engineers, July 2007. DOI:10.1002/9780470231616</w:t>
-      </w:r>
-      <w:bookmarkStart w:id="17" w:name="_Ref228545168"/>
+        <w:rPr>
+          <w:noProof w:val="0"/>
+          <w:lang w:val="en-GB"/>
+        </w:rPr>
+      </w:pPr>
+      <w:bookmarkStart w:id="16" w:name="_Ref228403345"/>
+      <w:r>
+        <w:rPr>
+          <w:noProof w:val="0"/>
+          <w:lang w:val="en-GB"/>
+        </w:rPr>
+        <w:t>F. Carvalhal, Simulation of Seismic Disturbances Using Adaptive Control, MSc Thesis, Victoria University of Manchester, Institute of Science and Technology, October 1974.</w:t>
+      </w:r>
       <w:bookmarkEnd w:id="16"/>
     </w:p>
     <w:p>
@@ -8424,76 +7958,141 @@
         <w:pStyle w:val="references"/>
         <w:rPr>
           <w:noProof w:val="0"/>
-          <w:lang w:val="en-GB"/>
-        </w:rPr>
-      </w:pPr>
-      <w:bookmarkStart w:id="18" w:name="_Ref228560636"/>
-      <w:r>
-        <w:t xml:space="preserve">A. Henrique, M. Ayala Botto, F. </w:t>
-      </w:r>
-      <w:r>
-        <w:rPr>
-          <w:noProof w:val="0"/>
-        </w:rPr>
-        <w:t>Oliveira, “Development of control strategies for earthquake reproduction on uniaxial shaking table</w:t>
-      </w:r>
-      <w:r>
-        <w:t>,” 13º Congresso Nacional de Mecânica Experimental – CNME2026, Universidade do Porto, Porto, 2026.</w:t>
-      </w:r>
-      <w:bookmarkStart w:id="19" w:name="_Ref228547076"/>
+          <w:lang w:val="pt-PT"/>
+        </w:rPr>
+      </w:pPr>
+      <w:bookmarkStart w:id="17" w:name="_Ref228403347"/>
+      <w:r>
+        <w:rPr>
+          <w:noProof w:val="0"/>
+          <w:lang w:val="pt-PT"/>
+        </w:rPr>
+        <w:t>F. Carvalhal, Controlo Adaptativo na Simulação de Solicitações Sísmicas, Tese para Especialista LNEC, STG/DPA, Proc. 76/13/5588, Lisboa, Ja</w:t>
+      </w:r>
+      <w:r>
+        <w:rPr>
+          <w:noProof w:val="0"/>
+          <w:lang w:val="pt-PT"/>
+        </w:rPr>
+        <w:t xml:space="preserve">nuary </w:t>
+      </w:r>
+      <w:r>
+        <w:rPr>
+          <w:noProof w:val="0"/>
+          <w:lang w:val="pt-PT"/>
+        </w:rPr>
+        <w:t>1979.</w:t>
+      </w:r>
       <w:bookmarkEnd w:id="17"/>
+    </w:p>
+    <w:p>
+      <w:pPr>
+        <w:pStyle w:val="references"/>
+        <w:rPr>
+          <w:noProof w:val="0"/>
+          <w:lang w:val="en-GB"/>
+        </w:rPr>
+      </w:pPr>
+      <w:bookmarkStart w:id="18" w:name="_Ref228403730"/>
+      <w:r>
+        <w:rPr>
+          <w:noProof w:val="0"/>
+          <w:lang w:val="en-GB"/>
+        </w:rPr>
+        <w:t>K. Ogata, Modern Control Engineering. 5th Edition, Pearson, Upper Saddle River, 2010.</w:t>
+      </w:r>
       <w:bookmarkEnd w:id="18"/>
     </w:p>
     <w:p>
       <w:pPr>
         <w:pStyle w:val="references"/>
-        <w:rPr>
-          <w:lang w:val="pt-PT"/>
-        </w:rPr>
-      </w:pPr>
-      <w:bookmarkStart w:id="20" w:name="_Ref228407164"/>
+      </w:pPr>
+      <w:bookmarkStart w:id="19" w:name="_Ref228386698"/>
+      <w:r>
+        <w:rPr>
+          <w:noProof w:val="0"/>
+          <w:lang w:val="en-GB"/>
+        </w:rPr>
+        <w:t>B. Widrow, E. Walach, Adaptive Inverse Control: A Signal Processing Approach, Institute of Electrical and Electronic Engineers, July 2007. DOI:10.1002/9780470231616</w:t>
+      </w:r>
+      <w:bookmarkStart w:id="20" w:name="_Ref228545168"/>
       <w:bookmarkEnd w:id="19"/>
-      <w:r>
-        <w:rPr>
-          <w:noProof w:val="0"/>
-          <w:lang w:val="en-GB"/>
-        </w:rPr>
-        <w:t>G. G. Tekeste, Real-Time Hybrid Simulation including a Shaking Table – Development and Application to Soil-Structure Interaction. PhD Thesis</w:t>
-      </w:r>
-      <w:r>
-        <w:rPr>
-          <w:noProof w:val="0"/>
-          <w:lang w:val="en-GB"/>
-        </w:rPr>
-        <w:t>,</w:t>
-      </w:r>
-      <w:r>
-        <w:rPr>
-          <w:noProof w:val="0"/>
-          <w:lang w:val="en-GB"/>
-        </w:rPr>
-        <w:t xml:space="preserve"> Univ</w:t>
-      </w:r>
-      <w:r>
-        <w:rPr>
-          <w:noProof w:val="0"/>
-          <w:lang w:val="en-GB"/>
-        </w:rPr>
-        <w:t>ersity of</w:t>
-      </w:r>
-      <w:r>
-        <w:rPr>
-          <w:noProof w:val="0"/>
-          <w:lang w:val="en-GB"/>
-        </w:rPr>
-        <w:t xml:space="preserve"> Aveiro, 2021.</w:t>
-      </w:r>
-      <w:bookmarkStart w:id="21" w:name="_Ref228545689"/>
-      <w:bookmarkEnd w:id="20"/>
     </w:p>
     <w:p>
       <w:pPr>
         <w:pStyle w:val="references"/>
+        <w:rPr>
+          <w:noProof w:val="0"/>
+          <w:lang w:val="en-GB"/>
+        </w:rPr>
+      </w:pPr>
+      <w:bookmarkStart w:id="21" w:name="_Ref228560636"/>
+      <w:r>
+        <w:t xml:space="preserve">A. Henrique, M. Ayala Botto, F. </w:t>
+      </w:r>
+      <w:r>
+        <w:rPr>
+          <w:noProof w:val="0"/>
+        </w:rPr>
+        <w:t>Oliveira, “Development of control strategies for earthquake reproduction on uniaxial shaking table</w:t>
+      </w:r>
+      <w:r>
+        <w:t>,” 13º Congresso Nacional de Mecânica Experimental – CNME2026, Universidade do Porto, Porto, 2026.</w:t>
+      </w:r>
+      <w:bookmarkStart w:id="22" w:name="_Ref228547076"/>
+      <w:bookmarkEnd w:id="20"/>
+      <w:bookmarkEnd w:id="21"/>
+    </w:p>
+    <w:p>
+      <w:pPr>
+        <w:pStyle w:val="references"/>
+        <w:rPr>
+          <w:lang w:val="pt-PT"/>
+        </w:rPr>
+      </w:pPr>
+      <w:bookmarkStart w:id="23" w:name="_Ref228407164"/>
+      <w:bookmarkEnd w:id="22"/>
+      <w:r>
+        <w:rPr>
+          <w:noProof w:val="0"/>
+          <w:lang w:val="en-GB"/>
+        </w:rPr>
+        <w:t>G. G. Tekeste, Real-Time Hybrid Simulation including a Shaking Table – Development and Application to Soil-Structure Interaction. PhD Thesis</w:t>
+      </w:r>
+      <w:r>
+        <w:rPr>
+          <w:noProof w:val="0"/>
+          <w:lang w:val="en-GB"/>
+        </w:rPr>
+        <w:t>,</w:t>
+      </w:r>
+      <w:r>
+        <w:rPr>
+          <w:noProof w:val="0"/>
+          <w:lang w:val="en-GB"/>
+        </w:rPr>
+        <w:t xml:space="preserve"> Univ</w:t>
+      </w:r>
+      <w:r>
+        <w:rPr>
+          <w:noProof w:val="0"/>
+          <w:lang w:val="en-GB"/>
+        </w:rPr>
+        <w:t>ersity of</w:t>
+      </w:r>
+      <w:r>
+        <w:rPr>
+          <w:noProof w:val="0"/>
+          <w:lang w:val="en-GB"/>
+        </w:rPr>
+        <w:t xml:space="preserve"> Aveiro, 2021.</w:t>
+      </w:r>
+      <w:bookmarkStart w:id="24" w:name="_Ref228545689"/>
+      <w:bookmarkEnd w:id="23"/>
+    </w:p>
+    <w:p>
+      <w:pPr>
+        <w:pStyle w:val="references"/>
       </w:pPr>
       <w:r>
         <w:t xml:space="preserve">N. </w:t>
@@ -8528,200 +8127,59 @@
       <w:r>
         <w:t xml:space="preserve"> </w:t>
       </w:r>
-      <w:hyperlink r:id="rId21" w:history="1">
+      <w:hyperlink r:id="rId25" w:history="1">
         <w:r>
           <w:rPr>
-            <w:rStyle w:val="Hyperlink"/>
+            <w:rStyle w:val="Hiperligao"/>
           </w:rPr>
           <w:t>https://doi.org/10.1016/j.engstruct.2010.03.025</w:t>
         </w:r>
       </w:hyperlink>
-      <w:bookmarkEnd w:id="21"/>
+      <w:bookmarkEnd w:id="24"/>
     </w:p>
     <w:p>
       <w:pPr>
         <w:pStyle w:val="references"/>
       </w:pPr>
-      <w:bookmarkStart w:id="22" w:name="_Ref228546191"/>
+      <w:bookmarkStart w:id="25" w:name="_Ref228546191"/>
       <w:r>
         <w:t xml:space="preserve">B. M. Phillips, B. F. Spencer, “Model-based feedforward-feedback actuator control for real-time hybrid simulation,” Journal of Structural Engineering, 139(7), 1205–1214, 2012. </w:t>
       </w:r>
-      <w:hyperlink r:id="rId22" w:history="1">
+      <w:hyperlink r:id="rId26" w:history="1">
         <w:r>
           <w:rPr>
-            <w:rStyle w:val="Hyperlink"/>
+            <w:rStyle w:val="Hiperligao"/>
           </w:rPr>
           <w:t>https://doi.org/10.1061/(ASCE)ST.1943-541X.0000606</w:t>
         </w:r>
       </w:hyperlink>
-      <w:bookmarkEnd w:id="22"/>
+      <w:bookmarkEnd w:id="25"/>
     </w:p>
     <w:p>
       <w:pPr>
         <w:pStyle w:val="references"/>
       </w:pPr>
-      <w:bookmarkStart w:id="23" w:name="_Ref228546836"/>
+      <w:bookmarkStart w:id="26" w:name="_Ref228546836"/>
       <w:r>
         <w:t xml:space="preserve">B. M. Phillips, N. E. Wierschem, B. F. Spencer Jr, “Model-based multi-metric control of uniaxial shake tables,” Earthquake Engineering &amp; Structural Dynamics, 43(5), 681–699, 2014. </w:t>
       </w:r>
-      <w:hyperlink r:id="rId23" w:history="1">
+      <w:hyperlink r:id="rId27" w:history="1">
         <w:r>
           <w:rPr>
-            <w:rStyle w:val="Hyperlink"/>
+            <w:rStyle w:val="Hiperligao"/>
           </w:rPr>
           <w:t>https://doi.org/10.1002/eqe.2366</w:t>
         </w:r>
       </w:hyperlink>
-      <w:bookmarkEnd w:id="23"/>
+      <w:bookmarkEnd w:id="26"/>
     </w:p>
     <w:p>
       <w:pPr>
         <w:pStyle w:val="references"/>
       </w:pPr>
-      <w:bookmarkStart w:id="24" w:name="_Ref228546852"/>
+      <w:bookmarkStart w:id="27" w:name="_Ref228546852"/>
       <w:r>
         <w:t>D. P. Stoten, E. G. Gómez, “Adaptive control of shaking tables using the minimal control synthesis algorithm,” Philosophical Trans. Of The Royal Society 359(1786):1697-1723, Setember 2001. DOI:10.1098/rsta.2001.0862</w:t>
-      </w:r>
-      <w:bookmarkEnd w:id="24"/>
-    </w:p>
-    <w:p>
-      <w:pPr>
-        <w:pStyle w:val="references"/>
-      </w:pPr>
-      <w:bookmarkStart w:id="25" w:name="_Ref228489482"/>
-      <w:bookmarkStart w:id="26" w:name="_Ref228416207"/>
-      <w:r>
-        <w:rPr>
-          <w:noProof w:val="0"/>
-        </w:rPr>
-        <w:t>P</w:t>
-      </w:r>
-      <w:r>
-        <w:rPr>
-          <w:noProof w:val="0"/>
-        </w:rPr>
-        <w:t>.</w:t>
-      </w:r>
-      <w:r>
-        <w:t xml:space="preserve"> M.</w:t>
-      </w:r>
-      <w:r>
-        <w:rPr>
-          <w:noProof w:val="0"/>
-        </w:rPr>
-        <w:t xml:space="preserve"> </w:t>
-      </w:r>
-      <w:r>
-        <w:t xml:space="preserve">J. Van Den Hof, </w:t>
-      </w:r>
-      <w:r>
-        <w:rPr>
-          <w:noProof w:val="0"/>
-        </w:rPr>
-        <w:t>R</w:t>
-      </w:r>
-      <w:r>
-        <w:rPr>
-          <w:noProof w:val="0"/>
-        </w:rPr>
-        <w:t>.</w:t>
-      </w:r>
-      <w:r>
-        <w:t xml:space="preserve"> J.</w:t>
-      </w:r>
-      <w:r>
-        <w:rPr>
-          <w:noProof w:val="0"/>
-        </w:rPr>
-        <w:t xml:space="preserve"> </w:t>
-      </w:r>
-      <w:r>
-        <w:t>P. Schrama,</w:t>
-      </w:r>
-      <w:r>
-        <w:rPr>
-          <w:noProof w:val="0"/>
-        </w:rPr>
-        <w:t xml:space="preserve"> “</w:t>
-      </w:r>
-      <w:r>
-        <w:rPr>
-          <w:noProof w:val="0"/>
-        </w:rPr>
-        <w:t>An indirect method for transfer function estimation from closed loop data,</w:t>
-      </w:r>
-      <w:r>
-        <w:rPr>
-          <w:noProof w:val="0"/>
-        </w:rPr>
-        <w:t xml:space="preserve">” </w:t>
-      </w:r>
-      <w:r>
-        <w:t>Automatica,</w:t>
-      </w:r>
-      <w:r>
-        <w:rPr>
-          <w:noProof w:val="0"/>
-        </w:rPr>
-        <w:t xml:space="preserve"> </w:t>
-      </w:r>
-      <w:r>
-        <w:t>Volume 29, Issue 6,</w:t>
-      </w:r>
-      <w:r>
-        <w:rPr>
-          <w:noProof w:val="0"/>
-        </w:rPr>
-        <w:t xml:space="preserve"> </w:t>
-      </w:r>
-      <w:r>
-        <w:t>Pages 1523-1527</w:t>
-      </w:r>
-      <w:r>
-        <w:t>,</w:t>
-      </w:r>
-      <w:r>
-        <w:rPr>
-          <w:noProof w:val="0"/>
-        </w:rPr>
-        <w:t xml:space="preserve"> </w:t>
-      </w:r>
-      <w:r>
-        <w:rPr>
-          <w:noProof w:val="0"/>
-        </w:rPr>
-        <w:t>1993</w:t>
-      </w:r>
-      <w:r>
-        <w:rPr>
-          <w:noProof w:val="0"/>
-        </w:rPr>
-        <w:t xml:space="preserve">. DOI: </w:t>
-      </w:r>
-      <w:r>
-        <w:rPr>
-          <w:noProof w:val="0"/>
-        </w:rPr>
-        <w:t>10.1016/0005-1098(93)90015-L.</w:t>
-      </w:r>
-      <w:bookmarkEnd w:id="25"/>
-    </w:p>
-    <w:p>
-      <w:pPr>
-        <w:pStyle w:val="references"/>
-      </w:pPr>
-      <w:bookmarkStart w:id="27" w:name="_Ref228490080"/>
-      <w:r>
-        <w:t xml:space="preserve">J. C. A. </w:t>
-      </w:r>
-      <w:r>
-        <w:t>Lagarias, Reeds, M. H. Wright, P. E. Wright. “Convergence Properties of the Nelder-Mead Simplex Method in Low Dimensions.” SIAM Journal of Optimization. Vol. 9, Number 1, 1998, pp. 112–147.</w:t>
-      </w:r>
-      <w:r>
-        <w:t xml:space="preserve"> </w:t>
-      </w:r>
-      <w:r>
-        <w:t>DOI:10.1137/S1052623496303470</w:t>
       </w:r>
       <w:bookmarkEnd w:id="27"/>
     </w:p>
@@ -8729,8 +8187,149 @@
       <w:pPr>
         <w:pStyle w:val="references"/>
       </w:pPr>
-      <w:bookmarkStart w:id="28" w:name="_Ref228489452"/>
-      <w:bookmarkEnd w:id="26"/>
+      <w:bookmarkStart w:id="28" w:name="_Ref228489482"/>
+      <w:bookmarkStart w:id="29" w:name="_Ref228416207"/>
+      <w:r>
+        <w:rPr>
+          <w:noProof w:val="0"/>
+        </w:rPr>
+        <w:t>P</w:t>
+      </w:r>
+      <w:r>
+        <w:rPr>
+          <w:noProof w:val="0"/>
+        </w:rPr>
+        <w:t>.</w:t>
+      </w:r>
+      <w:r>
+        <w:t xml:space="preserve"> M.</w:t>
+      </w:r>
+      <w:r>
+        <w:rPr>
+          <w:noProof w:val="0"/>
+        </w:rPr>
+        <w:t xml:space="preserve"> </w:t>
+      </w:r>
+      <w:r>
+        <w:t xml:space="preserve">J. Van Den Hof, </w:t>
+      </w:r>
+      <w:r>
+        <w:rPr>
+          <w:noProof w:val="0"/>
+        </w:rPr>
+        <w:t>R</w:t>
+      </w:r>
+      <w:r>
+        <w:rPr>
+          <w:noProof w:val="0"/>
+        </w:rPr>
+        <w:t>.</w:t>
+      </w:r>
+      <w:r>
+        <w:t xml:space="preserve"> J.</w:t>
+      </w:r>
+      <w:r>
+        <w:rPr>
+          <w:noProof w:val="0"/>
+        </w:rPr>
+        <w:t xml:space="preserve"> </w:t>
+      </w:r>
+      <w:r>
+        <w:t>P. Schrama,</w:t>
+      </w:r>
+      <w:r>
+        <w:rPr>
+          <w:noProof w:val="0"/>
+        </w:rPr>
+        <w:t xml:space="preserve"> “</w:t>
+      </w:r>
+      <w:r>
+        <w:rPr>
+          <w:noProof w:val="0"/>
+        </w:rPr>
+        <w:t>An indirect method for transfer function estimation from closed loop data,</w:t>
+      </w:r>
+      <w:r>
+        <w:rPr>
+          <w:noProof w:val="0"/>
+        </w:rPr>
+        <w:t xml:space="preserve">” </w:t>
+      </w:r>
+      <w:r>
+        <w:t>Automatica,</w:t>
+      </w:r>
+      <w:r>
+        <w:rPr>
+          <w:noProof w:val="0"/>
+        </w:rPr>
+        <w:t xml:space="preserve"> </w:t>
+      </w:r>
+      <w:r>
+        <w:t>Volume 29, Issue 6,</w:t>
+      </w:r>
+      <w:r>
+        <w:rPr>
+          <w:noProof w:val="0"/>
+        </w:rPr>
+        <w:t xml:space="preserve"> </w:t>
+      </w:r>
+      <w:r>
+        <w:t>Pages 1523-1527</w:t>
+      </w:r>
+      <w:r>
+        <w:t>,</w:t>
+      </w:r>
+      <w:r>
+        <w:rPr>
+          <w:noProof w:val="0"/>
+        </w:rPr>
+        <w:t xml:space="preserve"> </w:t>
+      </w:r>
+      <w:r>
+        <w:rPr>
+          <w:noProof w:val="0"/>
+        </w:rPr>
+        <w:t>1993</w:t>
+      </w:r>
+      <w:r>
+        <w:rPr>
+          <w:noProof w:val="0"/>
+        </w:rPr>
+        <w:t xml:space="preserve">. DOI: </w:t>
+      </w:r>
+      <w:r>
+        <w:rPr>
+          <w:noProof w:val="0"/>
+        </w:rPr>
+        <w:t>10.1016/0005-1098(93)90015-L.</w:t>
+      </w:r>
+      <w:bookmarkEnd w:id="28"/>
+    </w:p>
+    <w:p>
+      <w:pPr>
+        <w:pStyle w:val="references"/>
+      </w:pPr>
+      <w:bookmarkStart w:id="30" w:name="_Ref228490080"/>
+      <w:r>
+        <w:t xml:space="preserve">J. C. A. </w:t>
+      </w:r>
+      <w:r>
+        <w:t>Lagarias, Reeds, M. H. Wright, P. E. Wright. “Convergence Properties of the Nelder-Mead Simplex Method in Low Dimensions.” SIAM Journal of Optimization. Vol. 9, Number 1, 1998, pp. 112–147.</w:t>
+      </w:r>
+      <w:r>
+        <w:t xml:space="preserve"> </w:t>
+      </w:r>
+      <w:r>
+        <w:t>DOI:10.1137/S1052623496303470</w:t>
+      </w:r>
+      <w:bookmarkEnd w:id="30"/>
+    </w:p>
+    <w:p>
+      <w:pPr>
+        <w:pStyle w:val="references"/>
+      </w:pPr>
+      <w:bookmarkStart w:id="31" w:name="_Ref228489452"/>
+      <w:bookmarkEnd w:id="29"/>
       <w:r>
         <w:rPr>
           <w:noProof w:val="0"/>
@@ -8815,7 +8414,7 @@
         </w:rPr>
         <w:t>DOI: 10.1002/stc.99</w:t>
       </w:r>
-      <w:bookmarkEnd w:id="28"/>
+      <w:bookmarkEnd w:id="31"/>
     </w:p>
     <w:p>
       <w:pPr>
@@ -8872,6 +8471,86 @@
 </w:document>
 </file>
 
+<file path=word/comments.xml><?xml version="1.0" encoding="utf-8"?>
+<w:comments xmlns:cx="http://schemas.microsoft.com/office/drawing/2014/chartex" xmlns:cx1="http://schemas.microsoft.com/office/drawing/2015/9/8/chartex" xmlns:cx2="http://schemas.microsoft.com/office/drawing/2015/10/21/chartex" xmlns:cx3="http://schemas.microsoft.com/office/drawing/2016/5/9/chartex" xmlns:cx4="http://schemas.microsoft.com/office/drawing/2016/5/10/chartex" xmlns:cx5="http://schemas.microsoft.com/office/drawing/2016/5/11/chartex" xmlns:cx6="http://schemas.microsoft.com/office/drawing/2016/5/12/chartex" xmlns:cx7="http://schemas.microsoft.com/office/drawing/2016/5/13/chartex" xmlns:cx8="http://schemas.microsoft.com/office/drawing/2016/5/14/chartex" xmlns:mc="http://schemas.openxmlformats.org/markup-compatibility/2006" xmlns:aink="http://schemas.microsoft.com/office/drawing/2016/ink" xmlns:am3d="http://schemas.microsoft.com/office/drawing/2017/model3d" xmlns:o="urn:schemas-microsoft-com:office:office" xmlns:oel="http://schemas.microsoft.com/office/2019/extlst" xmlns:r="http://purl.oclc.org/ooxml/officeDocument/relationships" xmlns:m="http://purl.oclc.org/ooxml/officeDocument/math" xmlns:v="urn:schemas-microsoft-com:vml" xmlns:wp14="http://schemas.microsoft.com/office/word/2010/wordprocessingDrawing" xmlns:wp="http://purl.oclc.org/ooxml/drawingml/wordprocessingDrawing" xmlns:w10="urn:schemas-microsoft-com:office:word" xmlns:w="http://purl.oclc.org/ooxml/wordprocessingml/main" xmlns:w14="http://schemas.microsoft.com/office/word/2010/wordml" xmlns:w15="http://schemas.microsoft.com/office/word/2012/wordml" xmlns:w16cex="http://schemas.microsoft.com/office/word/2018/wordml/cex" xmlns:w16cid="http://schemas.microsoft.com/office/word/2016/wordml/cid" xmlns:w16="http://schemas.microsoft.com/office/word/2018/wordml" xmlns:w16du="http://schemas.microsoft.com/office/word/2023/wordml/word16du" xmlns:w16sdtdh="http://schemas.microsoft.com/office/word/2020/wordml/sdtdatahash" xmlns:w16sdtfl="http://schemas.microsoft.com/office/word/2024/wordml/sdtformatlock" xmlns:w16se="http://schemas.microsoft.com/office/word/2015/wordml/symex" xmlns:wpi="http://schemas.microsoft.com/office/word/2010/wordprocessingInk" xmlns:wne="http://schemas.microsoft.com/office/word/2006/wordml" mc:Ignorable="w14 w15 w16se w16cid w16 w16cex w16sdtdh w16sdtfl w16du wne wp14">
+  <w:comment w:id="3" w:author="afonso henrique" w:date="2026-05-12T10:57:00Z" w:initials="ah">
+    <w:p>
+      <w:pPr>
+        <w:pStyle w:val="Textodecomentrio"/>
+        <w:jc w:val="start"/>
+      </w:pPr>
+      <w:r>
+        <w:rPr>
+          <w:rStyle w:val="Refdecomentrio"/>
+        </w:rPr>
+        <w:annotationRef/>
+      </w:r>
+      <w:r>
+        <w:t>S0C</w:t>
+      </w:r>
+    </w:p>
+  </w:comment>
+  <w:comment w:id="4" w:author="afonso henrique" w:date="2026-05-12T10:57:00Z" w:initials="ah">
+    <w:p>
+      <w:pPr>
+        <w:pStyle w:val="Textodecomentrio"/>
+        <w:jc w:val="start"/>
+      </w:pPr>
+      <w:r>
+        <w:rPr>
+          <w:rStyle w:val="Refdecomentrio"/>
+        </w:rPr>
+        <w:annotationRef/>
+      </w:r>
+      <w:r>
+        <w:t>sensitivity</w:t>
+      </w:r>
+    </w:p>
+  </w:comment>
+  <w:comment w:id="6" w:author="afonso henrique" w:date="2026-05-12T12:01:00Z" w:initials="ah">
+    <w:p>
+      <w:pPr>
+        <w:pStyle w:val="Textodecomentrio"/>
+        <w:jc w:val="start"/>
+      </w:pPr>
+      <w:r>
+        <w:rPr>
+          <w:rStyle w:val="Refdecomentrio"/>
+        </w:rPr>
+        <w:annotationRef/>
+      </w:r>
+      <w:r>
+        <w:t>Newhall</w:t>
+      </w:r>
+    </w:p>
+  </w:comment>
+</w:comments>
+</file>
+
+<file path=word/commentsExtended.xml><?xml version="1.0" encoding="utf-8"?>
+<w15:commentsEx xmlns:cx="http://schemas.microsoft.com/office/drawing/2014/chartex" xmlns:cx1="http://schemas.microsoft.com/office/drawing/2015/9/8/chartex" xmlns:cx2="http://schemas.microsoft.com/office/drawing/2015/10/21/chartex" xmlns:cx3="http://schemas.microsoft.com/office/drawing/2016/5/9/chartex" xmlns:cx4="http://schemas.microsoft.com/office/drawing/2016/5/10/chartex" xmlns:cx5="http://schemas.microsoft.com/office/drawing/2016/5/11/chartex" xmlns:cx6="http://schemas.microsoft.com/office/drawing/2016/5/12/chartex" xmlns:cx7="http://schemas.microsoft.com/office/drawing/2016/5/13/chartex" xmlns:cx8="http://schemas.microsoft.com/office/drawing/2016/5/14/chartex" xmlns:mc="http://schemas.openxmlformats.org/markup-compatibility/2006" xmlns:aink="http://schemas.microsoft.com/office/drawing/2016/ink" xmlns:am3d="http://schemas.microsoft.com/office/drawing/2017/model3d" xmlns:o="urn:schemas-microsoft-com:office:office" xmlns:oel="http://schemas.microsoft.com/office/2019/extlst" xmlns:r="http://purl.oclc.org/ooxml/officeDocument/relationships" xmlns:m="http://purl.oclc.org/ooxml/officeDocument/math" xmlns:v="urn:schemas-microsoft-com:vml" xmlns:wp14="http://schemas.microsoft.com/office/word/2010/wordprocessingDrawing" xmlns:wp="http://purl.oclc.org/ooxml/drawingml/wordprocessingDrawing" xmlns:w10="urn:schemas-microsoft-com:office:word" xmlns:w="http://purl.oclc.org/ooxml/wordprocessingml/main" xmlns:w14="http://schemas.microsoft.com/office/word/2010/wordml" xmlns:w15="http://schemas.microsoft.com/office/word/2012/wordml" xmlns:w16cex="http://schemas.microsoft.com/office/word/2018/wordml/cex" xmlns:w16cid="http://schemas.microsoft.com/office/word/2016/wordml/cid" xmlns:w16="http://schemas.microsoft.com/office/word/2018/wordml" xmlns:w16du="http://schemas.microsoft.com/office/word/2023/wordml/word16du" xmlns:w16sdtdh="http://schemas.microsoft.com/office/word/2020/wordml/sdtdatahash" xmlns:w16sdtfl="http://schemas.microsoft.com/office/word/2024/wordml/sdtformatlock" xmlns:w16se="http://schemas.microsoft.com/office/word/2015/wordml/symex" xmlns:wpi="http://schemas.microsoft.com/office/word/2010/wordprocessingInk" xmlns:wne="http://schemas.microsoft.com/office/word/2006/wordml" mc:Ignorable="w14 w15 w16se w16cid w16 w16cex w16sdtdh w16sdtfl w16du wne wp14">
+  <w15:commentEx w15:paraId="4460D4AE" w15:done="0"/>
+  <w15:commentEx w15:paraId="437F9E91" w15:done="0"/>
+  <w15:commentEx w15:paraId="78CB4A00" w15:done="0"/>
+</w15:commentsEx>
+</file>
+
+<file path=word/commentsExtensible.xml><?xml version="1.0" encoding="utf-8"?>
+<w16cex:commentsExtensible xmlns:cx="http://schemas.microsoft.com/office/drawing/2014/chartex" xmlns:cx1="http://schemas.microsoft.com/office/drawing/2015/9/8/chartex" xmlns:cx2="http://schemas.microsoft.com/office/drawing/2015/10/21/chartex" xmlns:cx3="http://schemas.microsoft.com/office/drawing/2016/5/9/chartex" xmlns:cx4="http://schemas.microsoft.com/office/drawing/2016/5/10/chartex" xmlns:cx5="http://schemas.microsoft.com/office/drawing/2016/5/11/chartex" xmlns:cx6="http://schemas.microsoft.com/office/drawing/2016/5/12/chartex" xmlns:cx7="http://schemas.microsoft.com/office/drawing/2016/5/13/chartex" xmlns:cx8="http://schemas.microsoft.com/office/drawing/2016/5/14/chartex" xmlns:cr="http://schemas.microsoft.com/office/comments/2020/reactions" xmlns:mc="http://schemas.openxmlformats.org/markup-compatibility/2006" xmlns:aink="http://schemas.microsoft.com/office/drawing/2016/ink" xmlns:am3d="http://schemas.microsoft.com/office/drawing/2017/model3d" xmlns:o="urn:schemas-microsoft-com:office:office" xmlns:oel="http://schemas.microsoft.com/office/2019/extlst" xmlns:r="http://purl.oclc.org/ooxml/officeDocument/relationships" xmlns:m="http://purl.oclc.org/ooxml/officeDocument/math" xmlns:v="urn:schemas-microsoft-com:vml" xmlns:wp14="http://schemas.microsoft.com/office/word/2010/wordprocessingDrawing" xmlns:wp="http://purl.oclc.org/ooxml/drawingml/wordprocessingDrawing" xmlns:w10="urn:schemas-microsoft-com:office:word" xmlns:w="http://purl.oclc.org/ooxml/wordprocessingml/main" xmlns:w14="http://schemas.microsoft.com/office/word/2010/wordml" xmlns:w15="http://schemas.microsoft.com/office/word/2012/wordml" xmlns:w16cex="http://schemas.microsoft.com/office/word/2018/wordml/cex" xmlns:w16cid="http://schemas.microsoft.com/office/word/2016/wordml/cid" xmlns:w16="http://schemas.microsoft.com/office/word/2018/wordml" xmlns:w16du="http://schemas.microsoft.com/office/word/2023/wordml/word16du" xmlns:w16sdtdh="http://schemas.microsoft.com/office/word/2020/wordml/sdtdatahash" xmlns:w16sdtfl="http://schemas.microsoft.com/office/word/2024/wordml/sdtformatlock" xmlns:w16se="http://schemas.microsoft.com/office/word/2015/wordml/symex" xmlns:wpi="http://schemas.microsoft.com/office/word/2010/wordprocessingInk" xmlns:wne="http://schemas.microsoft.com/office/word/2006/wordml" mc:Ignorable="w14 w15 w16se w16cid w16 w16cex w16sdtdh w16sdtfl cr w16du wne wp14">
+  <w16cex:commentExtensible w16cex:durableId="1E8428D2" w16cex:dateUtc="2026-05-12T09:57:00Z"/>
+  <w16cex:commentExtensible w16cex:durableId="2453DBF9" w16cex:dateUtc="2026-05-12T09:57:00Z"/>
+  <w16cex:commentExtensible w16cex:durableId="6A019420" w16cex:dateUtc="2026-05-12T11:01:00Z"/>
+</w16cex:commentsExtensible>
+</file>
+
+<file path=word/commentsIds.xml><?xml version="1.0" encoding="utf-8"?>
+<w16cid:commentsIds xmlns:cx="http://schemas.microsoft.com/office/drawing/2014/chartex" xmlns:cx1="http://schemas.microsoft.com/office/drawing/2015/9/8/chartex" xmlns:cx2="http://schemas.microsoft.com/office/drawing/2015/10/21/chartex" xmlns:cx3="http://schemas.microsoft.com/office/drawing/2016/5/9/chartex" xmlns:cx4="http://schemas.microsoft.com/office/drawing/2016/5/10/chartex" xmlns:cx5="http://schemas.microsoft.com/office/drawing/2016/5/11/chartex" xmlns:cx6="http://schemas.microsoft.com/office/drawing/2016/5/12/chartex" xmlns:cx7="http://schemas.microsoft.com/office/drawing/2016/5/13/chartex" xmlns:cx8="http://schemas.microsoft.com/office/drawing/2016/5/14/chartex" xmlns:mc="http://schemas.openxmlformats.org/markup-compatibility/2006" xmlns:aink="http://schemas.microsoft.com/office/drawing/2016/ink" xmlns:am3d="http://schemas.microsoft.com/office/drawing/2017/model3d" xmlns:o="urn:schemas-microsoft-com:office:office" xmlns:oel="http://schemas.microsoft.com/office/2019/extlst" xmlns:r="http://purl.oclc.org/ooxml/officeDocument/relationships" xmlns:m="http://purl.oclc.org/ooxml/officeDocument/math" xmlns:v="urn:schemas-microsoft-com:vml" xmlns:wp14="http://schemas.microsoft.com/office/word/2010/wordprocessingDrawing" xmlns:wp="http://purl.oclc.org/ooxml/drawingml/wordprocessingDrawing" xmlns:w10="urn:schemas-microsoft-com:office:word" xmlns:w="http://purl.oclc.org/ooxml/wordprocessingml/main" xmlns:w14="http://schemas.microsoft.com/office/word/2010/wordml" xmlns:w15="http://schemas.microsoft.com/office/word/2012/wordml" xmlns:w16cex="http://schemas.microsoft.com/office/word/2018/wordml/cex" xmlns:w16cid="http://schemas.microsoft.com/office/word/2016/wordml/cid" xmlns:w16="http://schemas.microsoft.com/office/word/2018/wordml" xmlns:w16du="http://schemas.microsoft.com/office/word/2023/wordml/word16du" xmlns:w16sdtdh="http://schemas.microsoft.com/office/word/2020/wordml/sdtdatahash" xmlns:w16sdtfl="http://schemas.microsoft.com/office/word/2024/wordml/sdtformatlock" xmlns:w16se="http://schemas.microsoft.com/office/word/2015/wordml/symex" xmlns:wpi="http://schemas.microsoft.com/office/word/2010/wordprocessingInk" xmlns:wne="http://schemas.microsoft.com/office/word/2006/wordml" mc:Ignorable="w14 w15 w16se w16cid w16 w16cex w16sdtdh w16sdtfl w16du wne wp14">
+  <w16cid:commentId w16cid:paraId="4460D4AE" w16cid:durableId="1E8428D2"/>
+  <w16cid:commentId w16cid:paraId="437F9E91" w16cid:durableId="2453DBF9"/>
+  <w16cid:commentId w16cid:paraId="78CB4A00" w16cid:durableId="6A019420"/>
+</w16cid:commentsIds>
+</file>
+
 <file path=word/endnotes.xml><?xml version="1.0" encoding="utf-8"?>
 <w:endnotes xmlns:cx="http://schemas.microsoft.com/office/drawing/2014/chartex" xmlns:cx1="http://schemas.microsoft.com/office/drawing/2015/9/8/chartex" xmlns:cx2="http://schemas.microsoft.com/office/drawing/2015/10/21/chartex" xmlns:cx3="http://schemas.microsoft.com/office/drawing/2016/5/9/chartex" xmlns:cx4="http://schemas.microsoft.com/office/drawing/2016/5/10/chartex" xmlns:cx5="http://schemas.microsoft.com/office/drawing/2016/5/11/chartex" xmlns:cx6="http://schemas.microsoft.com/office/drawing/2016/5/12/chartex" xmlns:cx7="http://schemas.microsoft.com/office/drawing/2016/5/13/chartex" xmlns:cx8="http://schemas.microsoft.com/office/drawing/2016/5/14/chartex" xmlns:mc="http://schemas.openxmlformats.org/markup-compatibility/2006" xmlns:aink="http://schemas.microsoft.com/office/drawing/2016/ink" xmlns:am3d="http://schemas.microsoft.com/office/drawing/2017/model3d" xmlns:o="urn:schemas-microsoft-com:office:office" xmlns:oel="http://schemas.microsoft.com/office/2019/extlst" xmlns:r="http://purl.oclc.org/ooxml/officeDocument/relationships" xmlns:m="http://purl.oclc.org/ooxml/officeDocument/math" xmlns:v="urn:schemas-microsoft-com:vml" xmlns:wp14="http://schemas.microsoft.com/office/word/2010/wordprocessingDrawing" xmlns:wp="http://purl.oclc.org/ooxml/drawingml/wordprocessingDrawing" xmlns:w10="urn:schemas-microsoft-com:office:word" xmlns:w="http://purl.oclc.org/ooxml/wordprocessingml/main" xmlns:w14="http://schemas.microsoft.com/office/word/2010/wordml" xmlns:w15="http://schemas.microsoft.com/office/word/2012/wordml" xmlns:w16cex="http://schemas.microsoft.com/office/word/2018/wordml/cex" xmlns:w16cid="http://schemas.microsoft.com/office/word/2016/wordml/cid" xmlns:w16="http://schemas.microsoft.com/office/word/2018/wordml" xmlns:w16du="http://schemas.microsoft.com/office/word/2023/wordml/word16du" xmlns:w16sdtdh="http://schemas.microsoft.com/office/word/2020/wordml/sdtdatahash" xmlns:w16sdtfl="http://schemas.microsoft.com/office/word/2024/wordml/sdtformatlock" xmlns:w16se="http://schemas.microsoft.com/office/word/2015/wordml/symex" xmlns:wpi="http://schemas.microsoft.com/office/word/2010/wordprocessingInk" xmlns:wne="http://schemas.microsoft.com/office/word/2006/wordml" mc:Ignorable="w14 w15 w16se w16cid w16 w16cex w16sdtdh w16sdtfl w16du wne wp14">
   <w:endnote w:type="separator" w:id="-1">
@@ -8895,7 +8574,7 @@
 <w:ftr xmlns:cx="http://schemas.microsoft.com/office/drawing/2014/chartex" xmlns:cx1="http://schemas.microsoft.com/office/drawing/2015/9/8/chartex" xmlns:cx2="http://schemas.microsoft.com/office/drawing/2015/10/21/chartex" xmlns:cx3="http://schemas.microsoft.com/office/drawing/2016/5/9/chartex" xmlns:cx4="http://schemas.microsoft.com/office/drawing/2016/5/10/chartex" xmlns:cx5="http://schemas.microsoft.com/office/drawing/2016/5/11/chartex" xmlns:cx6="http://schemas.microsoft.com/office/drawing/2016/5/12/chartex" xmlns:cx7="http://schemas.microsoft.com/office/drawing/2016/5/13/chartex" xmlns:cx8="http://schemas.microsoft.com/office/drawing/2016/5/14/chartex" xmlns:mc="http://schemas.openxmlformats.org/markup-compatibility/2006" xmlns:aink="http://schemas.microsoft.com/office/drawing/2016/ink" xmlns:am3d="http://schemas.microsoft.com/office/drawing/2017/model3d" xmlns:o="urn:schemas-microsoft-com:office:office" xmlns:oel="http://schemas.microsoft.com/office/2019/extlst" xmlns:r="http://purl.oclc.org/ooxml/officeDocument/relationships" xmlns:m="http://purl.oclc.org/ooxml/officeDocument/math" xmlns:v="urn:schemas-microsoft-com:vml" xmlns:wp14="http://schemas.microsoft.com/office/word/2010/wordprocessingDrawing" xmlns:wp="http://purl.oclc.org/ooxml/drawingml/wordprocessingDrawing" xmlns:w10="urn:schemas-microsoft-com:office:word" xmlns:w="http://purl.oclc.org/ooxml/wordprocessingml/main" xmlns:w14="http://schemas.microsoft.com/office/word/2010/wordml" xmlns:w15="http://schemas.microsoft.com/office/word/2012/wordml" xmlns:w16cex="http://schemas.microsoft.com/office/word/2018/wordml/cex" xmlns:w16cid="http://schemas.microsoft.com/office/word/2016/wordml/cid" xmlns:w16="http://schemas.microsoft.com/office/word/2018/wordml" xmlns:w16du="http://schemas.microsoft.com/office/word/2023/wordml/word16du" xmlns:w16sdtdh="http://schemas.microsoft.com/office/word/2020/wordml/sdtdatahash" xmlns:w16sdtfl="http://schemas.microsoft.com/office/word/2024/wordml/sdtformatlock" xmlns:w16se="http://schemas.microsoft.com/office/word/2015/wordml/symex" xmlns:wpi="http://schemas.microsoft.com/office/word/2010/wordprocessingInk" xmlns:wne="http://schemas.microsoft.com/office/word/2006/wordml" mc:Ignorable="w14 w15 w16se w16cid w16 w16cex w16sdtdh w16sdtfl w16du wne wp14">
   <w:p>
     <w:pPr>
-      <w:pStyle w:val="Footer"/>
+      <w:pStyle w:val="Rodap"/>
       <w:jc w:val="start"/>
       <w:rPr>
         <w:sz w:val="16"/>
@@ -9988,7 +9667,7 @@
     <w:lvl w:ilvl="0">
       <w:start w:val="1"/>
       <w:numFmt w:val="upperRoman"/>
-      <w:pStyle w:val="Heading1"/>
+      <w:pStyle w:val="Ttulo1"/>
       <w:lvlText w:val="%1."/>
       <w:lvlJc w:val="center"/>
       <w:pPr>
@@ -10020,7 +9699,7 @@
     <w:lvl w:ilvl="1">
       <w:start w:val="1"/>
       <w:numFmt w:val="upperLetter"/>
-      <w:pStyle w:val="Heading2"/>
+      <w:pStyle w:val="Ttulo2"/>
       <w:lvlText w:val="%2."/>
       <w:lvlJc w:val="start"/>
       <w:pPr>
@@ -10056,7 +9735,7 @@
     <w:lvl w:ilvl="2">
       <w:start w:val="1"/>
       <w:numFmt w:val="decimal"/>
-      <w:pStyle w:val="Heading3"/>
+      <w:pStyle w:val="Ttulo3"/>
       <w:lvlText w:val="%3)"/>
       <w:lvlJc w:val="start"/>
       <w:pPr>
@@ -10092,7 +9771,7 @@
     <w:lvl w:ilvl="3">
       <w:start w:val="1"/>
       <w:numFmt w:val="lowerLetter"/>
-      <w:pStyle w:val="Heading4"/>
+      <w:pStyle w:val="Ttulo4"/>
       <w:lvlText w:val="%4)"/>
       <w:lvlJc w:val="start"/>
       <w:pPr>
@@ -10935,6 +10614,14 @@
     <w:abstractNumId w:val="23"/>
   </w:num>
 </w:numbering>
+</file>
+
+<file path=word/people.xml><?xml version="1.0" encoding="utf-8"?>
+<w15:people xmlns:cx="http://schemas.microsoft.com/office/drawing/2014/chartex" xmlns:cx1="http://schemas.microsoft.com/office/drawing/2015/9/8/chartex" xmlns:cx2="http://schemas.microsoft.com/office/drawing/2015/10/21/chartex" xmlns:cx3="http://schemas.microsoft.com/office/drawing/2016/5/9/chartex" xmlns:cx4="http://schemas.microsoft.com/office/drawing/2016/5/10/chartex" xmlns:cx5="http://schemas.microsoft.com/office/drawing/2016/5/11/chartex" xmlns:cx6="http://schemas.microsoft.com/office/drawing/2016/5/12/chartex" xmlns:cx7="http://schemas.microsoft.com/office/drawing/2016/5/13/chartex" xmlns:cx8="http://schemas.microsoft.com/office/drawing/2016/5/14/chartex" xmlns:mc="http://schemas.openxmlformats.org/markup-compatibility/2006" xmlns:aink="http://schemas.microsoft.com/office/drawing/2016/ink" xmlns:am3d="http://schemas.microsoft.com/office/drawing/2017/model3d" xmlns:o="urn:schemas-microsoft-com:office:office" xmlns:oel="http://schemas.microsoft.com/office/2019/extlst" xmlns:r="http://purl.oclc.org/ooxml/officeDocument/relationships" xmlns:m="http://purl.oclc.org/ooxml/officeDocument/math" xmlns:v="urn:schemas-microsoft-com:vml" xmlns:wp14="http://schemas.microsoft.com/office/word/2010/wordprocessingDrawing" xmlns:wp="http://purl.oclc.org/ooxml/drawingml/wordprocessingDrawing" xmlns:w10="urn:schemas-microsoft-com:office:word" xmlns:w="http://purl.oclc.org/ooxml/wordprocessingml/main" xmlns:w14="http://schemas.microsoft.com/office/word/2010/wordml" xmlns:w15="http://schemas.microsoft.com/office/word/2012/wordml" xmlns:w16cex="http://schemas.microsoft.com/office/word/2018/wordml/cex" xmlns:w16cid="http://schemas.microsoft.com/office/word/2016/wordml/cid" xmlns:w16="http://schemas.microsoft.com/office/word/2018/wordml" xmlns:w16du="http://schemas.microsoft.com/office/word/2023/wordml/word16du" xmlns:w16sdtdh="http://schemas.microsoft.com/office/word/2020/wordml/sdtdatahash" xmlns:w16sdtfl="http://schemas.microsoft.com/office/word/2024/wordml/sdtformatlock" xmlns:w16se="http://schemas.microsoft.com/office/word/2015/wordml/symex" xmlns:wpi="http://schemas.microsoft.com/office/word/2010/wordprocessingInk" xmlns:wne="http://schemas.microsoft.com/office/word/2006/wordml" mc:Ignorable="w14 w15 w16se w16cid w16 w16cex w16sdtdh w16sdtfl w16du wne wp14">
+  <w15:person w15:author="afonso henrique">
+    <w15:presenceInfo w15:providerId="Windows Live" w15:userId="4c363ee6d3460e7c"/>
+  </w15:person>
+</w15:people>
 </file>
 
 <file path=word/styles.xml><?xml version="1.0" encoding="utf-8"?>
@@ -11239,7 +10926,7 @@
       <w:lang w:val="en-GB"/>
     </w:rPr>
   </w:style>
-  <w:style w:type="paragraph" w:styleId="Heading1">
+  <w:style w:type="paragraph" w:styleId="Ttulo1">
     <w:name w:val="heading 1"/>
     <w:basedOn w:val="Normal"/>
     <w:next w:val="Normal"/>
@@ -11262,7 +10949,7 @@
       <w:noProof/>
     </w:rPr>
   </w:style>
-  <w:style w:type="paragraph" w:styleId="Heading2">
+  <w:style w:type="paragraph" w:styleId="Ttulo2">
     <w:name w:val="heading 2"/>
     <w:basedOn w:val="Normal"/>
     <w:next w:val="Normal"/>
@@ -11289,7 +10976,7 @@
       <w:noProof/>
     </w:rPr>
   </w:style>
-  <w:style w:type="paragraph" w:styleId="Heading3">
+  <w:style w:type="paragraph" w:styleId="Ttulo3">
     <w:name w:val="heading 3"/>
     <w:basedOn w:val="Normal"/>
     <w:next w:val="Normal"/>
@@ -11311,7 +10998,7 @@
       <w:noProof/>
     </w:rPr>
   </w:style>
-  <w:style w:type="paragraph" w:styleId="Heading4">
+  <w:style w:type="paragraph" w:styleId="Ttulo4">
     <w:name w:val="heading 4"/>
     <w:basedOn w:val="Normal"/>
     <w:next w:val="Normal"/>
@@ -11337,7 +11024,7 @@
       <w:noProof/>
     </w:rPr>
   </w:style>
-  <w:style w:type="paragraph" w:styleId="Heading5">
+  <w:style w:type="paragraph" w:styleId="Ttulo5">
     <w:name w:val="heading 5"/>
     <w:basedOn w:val="Normal"/>
     <w:next w:val="Normal"/>
@@ -11354,13 +11041,13 @@
       <w:noProof/>
     </w:rPr>
   </w:style>
-  <w:style w:type="character" w:default="1" w:styleId="DefaultParagraphFont">
+  <w:style w:type="character" w:default="1" w:styleId="Tipodeletrapredefinidodopargrafo">
     <w:name w:val="Default Paragraph Font"/>
     <w:uiPriority w:val="1"/>
     <w:semiHidden/>
     <w:unhideWhenUsed/>
   </w:style>
-  <w:style w:type="table" w:default="1" w:styleId="TableNormal">
+  <w:style w:type="table" w:default="1" w:styleId="Tabelanormal">
     <w:name w:val="Normal Table"/>
     <w:uiPriority w:val="99"/>
     <w:semiHidden/>
@@ -11375,7 +11062,7 @@
       </w:tblCellMar>
     </w:tblPr>
   </w:style>
-  <w:style w:type="numbering" w:default="1" w:styleId="NoList">
+  <w:style w:type="numbering" w:default="1" w:styleId="Semlista">
     <w:name w:val="No List"/>
     <w:uiPriority w:val="99"/>
     <w:semiHidden/>
@@ -11414,10 +11101,10 @@
       <w:szCs w:val="22"/>
     </w:rPr>
   </w:style>
-  <w:style w:type="paragraph" w:styleId="BodyText">
+  <w:style w:type="paragraph" w:styleId="Corpodetexto">
     <w:name w:val="Body Text"/>
     <w:basedOn w:val="Normal"/>
-    <w:link w:val="BodyTextChar"/>
+    <w:link w:val="CorpodetextoCarter"/>
     <w:rsid w:val="00706A64"/>
     <w:pPr>
       <w:tabs>
@@ -11432,9 +11119,9 @@
       <w:lang w:eastAsia="x-none"/>
     </w:rPr>
   </w:style>
-  <w:style w:type="character" w:customStyle="1" w:styleId="BodyTextChar">
-    <w:name w:val="Body Text Char"/>
-    <w:link w:val="BodyText"/>
+  <w:style w:type="character" w:customStyle="1" w:styleId="CorpodetextoCarter">
+    <w:name w:val="Corpo de texto Caráter"/>
+    <w:link w:val="Corpodetexto"/>
     <w:rsid w:val="00706A64"/>
     <w:rPr>
       <w:spacing w:val="-1"/>
@@ -11443,7 +11130,7 @@
   </w:style>
   <w:style w:type="paragraph" w:customStyle="1" w:styleId="bulletlist">
     <w:name w:val="bullet list"/>
-    <w:basedOn w:val="BodyText"/>
+    <w:basedOn w:val="Corpodetexto"/>
     <w:rsid w:val="001B67DC"/>
     <w:pPr>
       <w:numPr>
@@ -11636,10 +11323,10 @@
       <w:i/>
     </w:rPr>
   </w:style>
-  <w:style w:type="paragraph" w:styleId="Header">
+  <w:style w:type="paragraph" w:styleId="Cabealho">
     <w:name w:val="header"/>
     <w:basedOn w:val="Normal"/>
-    <w:link w:val="HeaderChar"/>
+    <w:link w:val="CabealhoCarter"/>
     <w:rsid w:val="001A3B3D"/>
     <w:pPr>
       <w:tabs>
@@ -11648,16 +11335,16 @@
       </w:tabs>
     </w:pPr>
   </w:style>
-  <w:style w:type="character" w:customStyle="1" w:styleId="HeaderChar">
-    <w:name w:val="Header Char"/>
-    <w:basedOn w:val="DefaultParagraphFont"/>
-    <w:link w:val="Header"/>
+  <w:style w:type="character" w:customStyle="1" w:styleId="CabealhoCarter">
+    <w:name w:val="Cabeçalho Caráter"/>
+    <w:basedOn w:val="Tipodeletrapredefinidodopargrafo"/>
+    <w:link w:val="Cabealho"/>
     <w:rsid w:val="001A3B3D"/>
   </w:style>
-  <w:style w:type="paragraph" w:styleId="Footer">
+  <w:style w:type="paragraph" w:styleId="Rodap">
     <w:name w:val="footer"/>
     <w:basedOn w:val="Normal"/>
-    <w:link w:val="FooterChar"/>
+    <w:link w:val="RodapCarter"/>
     <w:rsid w:val="001A3B3D"/>
     <w:pPr>
       <w:tabs>
@@ -11666,24 +11353,24 @@
       </w:tabs>
     </w:pPr>
   </w:style>
-  <w:style w:type="character" w:customStyle="1" w:styleId="FooterChar">
-    <w:name w:val="Footer Char"/>
-    <w:basedOn w:val="DefaultParagraphFont"/>
-    <w:link w:val="Footer"/>
+  <w:style w:type="character" w:customStyle="1" w:styleId="RodapCarter">
+    <w:name w:val="Rodapé Caráter"/>
+    <w:basedOn w:val="Tipodeletrapredefinidodopargrafo"/>
+    <w:link w:val="Rodap"/>
     <w:rsid w:val="001A3B3D"/>
   </w:style>
-  <w:style w:type="character" w:styleId="Hyperlink">
+  <w:style w:type="character" w:styleId="Hiperligao">
     <w:name w:val="Hyperlink"/>
-    <w:basedOn w:val="DefaultParagraphFont"/>
+    <w:basedOn w:val="Tipodeletrapredefinidodopargrafo"/>
     <w:rsid w:val="005333DB"/>
     <w:rPr>
       <w:color w:val="0563C1" w:themeColor="hyperlink"/>
       <w:u w:val="single"/>
     </w:rPr>
   </w:style>
-  <w:style w:type="character" w:styleId="UnresolvedMention">
+  <w:style w:type="character" w:styleId="MenoNoResolvida">
     <w:name w:val="Unresolved Mention"/>
-    <w:basedOn w:val="DefaultParagraphFont"/>
+    <w:basedOn w:val="Tipodeletrapredefinidodopargrafo"/>
     <w:uiPriority w:val="99"/>
     <w:semiHidden/>
     <w:unhideWhenUsed/>
@@ -11693,7 +11380,7 @@
       <w:shd w:val="clear" w:color="auto" w:fill="E1DFDD"/>
     </w:rPr>
   </w:style>
-  <w:style w:type="paragraph" w:styleId="Caption">
+  <w:style w:type="paragraph" w:styleId="Legenda">
     <w:name w:val="caption"/>
     <w:basedOn w:val="Normal"/>
     <w:next w:val="Normal"/>
@@ -11711,7 +11398,7 @@
       <w:szCs w:val="18"/>
     </w:rPr>
   </w:style>
-  <w:style w:type="paragraph" w:styleId="ListParagraph">
+  <w:style w:type="paragraph" w:styleId="PargrafodaLista">
     <w:name w:val="List Paragraph"/>
     <w:basedOn w:val="Normal"/>
     <w:uiPriority w:val="34"/>
@@ -11722,33 +11409,33 @@
       <w:contextualSpacing/>
     </w:pPr>
   </w:style>
-  <w:style w:type="paragraph" w:styleId="CommentText">
+  <w:style w:type="paragraph" w:styleId="Textodecomentrio">
     <w:name w:val="annotation text"/>
     <w:basedOn w:val="Normal"/>
-    <w:link w:val="CommentTextChar"/>
+    <w:link w:val="TextodecomentrioCarter"/>
     <w:rsid w:val="00052E74"/>
   </w:style>
-  <w:style w:type="character" w:customStyle="1" w:styleId="CommentTextChar">
-    <w:name w:val="Comment Text Char"/>
-    <w:basedOn w:val="DefaultParagraphFont"/>
-    <w:link w:val="CommentText"/>
+  <w:style w:type="character" w:customStyle="1" w:styleId="TextodecomentrioCarter">
+    <w:name w:val="Texto de comentário Caráter"/>
+    <w:basedOn w:val="Tipodeletrapredefinidodopargrafo"/>
+    <w:link w:val="Textodecomentrio"/>
     <w:rsid w:val="00052E74"/>
     <w:rPr>
       <w:lang w:val="en-GB"/>
     </w:rPr>
   </w:style>
-  <w:style w:type="character" w:styleId="CommentReference">
+  <w:style w:type="character" w:styleId="Refdecomentrio">
     <w:name w:val="annotation reference"/>
-    <w:basedOn w:val="DefaultParagraphFont"/>
+    <w:basedOn w:val="Tipodeletrapredefinidodopargrafo"/>
     <w:rsid w:val="00052E74"/>
     <w:rPr>
       <w:sz w:val="16"/>
       <w:szCs w:val="16"/>
     </w:rPr>
   </w:style>
-  <w:style w:type="character" w:styleId="PlaceholderText">
+  <w:style w:type="character" w:styleId="TextodoMarcadordePosio">
     <w:name w:val="Placeholder Text"/>
-    <w:basedOn w:val="DefaultParagraphFont"/>
+    <w:basedOn w:val="Tipodeletrapredefinidodopargrafo"/>
     <w:uiPriority w:val="99"/>
     <w:semiHidden/>
     <w:rsid w:val="00D14380"/>
@@ -11756,21 +11443,21 @@
       <w:color w:val="666666"/>
     </w:rPr>
   </w:style>
-  <w:style w:type="paragraph" w:styleId="CommentSubject">
+  <w:style w:type="paragraph" w:styleId="Assuntodecomentrio">
     <w:name w:val="annotation subject"/>
-    <w:basedOn w:val="CommentText"/>
-    <w:next w:val="CommentText"/>
-    <w:link w:val="CommentSubjectChar"/>
+    <w:basedOn w:val="Textodecomentrio"/>
+    <w:next w:val="Textodecomentrio"/>
+    <w:link w:val="AssuntodecomentrioCarter"/>
     <w:rsid w:val="00707D95"/>
     <w:rPr>
       <w:b/>
       <w:bCs/>
     </w:rPr>
   </w:style>
-  <w:style w:type="character" w:customStyle="1" w:styleId="CommentSubjectChar">
-    <w:name w:val="Comment Subject Char"/>
-    <w:basedOn w:val="CommentTextChar"/>
-    <w:link w:val="CommentSubject"/>
+  <w:style w:type="character" w:customStyle="1" w:styleId="AssuntodecomentrioCarter">
+    <w:name w:val="Assunto de comentário Caráter"/>
+    <w:basedOn w:val="TextodecomentrioCarter"/>
+    <w:link w:val="Assuntodecomentrio"/>
     <w:rsid w:val="00707D95"/>
     <w:rPr>
       <w:b/>
@@ -11778,16 +11465,16 @@
       <w:lang w:val="en-GB"/>
     </w:rPr>
   </w:style>
-  <w:style w:type="character" w:styleId="FollowedHyperlink">
+  <w:style w:type="character" w:styleId="Hiperligaovisitada">
     <w:name w:val="FollowedHyperlink"/>
-    <w:basedOn w:val="DefaultParagraphFont"/>
+    <w:basedOn w:val="Tipodeletrapredefinidodopargrafo"/>
     <w:rsid w:val="00EC71A3"/>
     <w:rPr>
       <w:color w:val="954F72" w:themeColor="followedHyperlink"/>
       <w:u w:val="single"/>
     </w:rPr>
   </w:style>
-  <w:style w:type="paragraph" w:styleId="Revision">
+  <w:style w:type="paragraph" w:styleId="Reviso">
     <w:name w:val="Revision"/>
     <w:hidden/>
     <w:uiPriority w:val="99"/>

</xml_diff>